<commit_message>
feat: updated the resume
</commit_message>
<xml_diff>
--- a/public/syedfiras.docx
+++ b/public/syedfiras.docx
@@ -1,6 +1,6 @@
 
 <file path=word/document.xml><?xml version="1.0" encoding="utf-8"?>
-<w:document xmlns:wpc="http://schemas.microsoft.com/office/word/2010/wordprocessingCanvas" xmlns:mc="http://schemas.openxmlformats.org/markup-compatibility/2006" xmlns:o="urn:schemas-microsoft-com:office:office" xmlns:r="http://schemas.openxmlformats.org/officeDocument/2006/relationships" xmlns:m="http://schemas.openxmlformats.org/officeDocument/2006/math" xmlns:v="urn:schemas-microsoft-com:vml" xmlns:wp14="http://schemas.microsoft.com/office/word/2010/wordprocessingDrawing" xmlns:wp="http://schemas.openxmlformats.org/drawingml/2006/wordprocessingDrawing" xmlns:w10="urn:schemas-microsoft-com:office:word" xmlns:w="http://schemas.openxmlformats.org/wordprocessingml/2006/main" xmlns:w14="http://schemas.microsoft.com/office/word/2010/wordml" xmlns:w15="http://schemas.microsoft.com/office/word/2012/wordml" xmlns:wpg="http://schemas.microsoft.com/office/word/2010/wordprocessingGroup" xmlns:wpi="http://schemas.microsoft.com/office/word/2010/wordprocessingInk" xmlns:wne="http://schemas.microsoft.com/office/word/2006/wordml" xmlns:wps="http://schemas.microsoft.com/office/word/2010/wordprocessingShape" xmlns:cx="http://schemas.microsoft.com/office/drawing/2014/chartex" xmlns:cx1="http://schemas.microsoft.com/office/drawing/2015/9/8/chartex" xmlns:cx2="http://schemas.microsoft.com/office/drawing/2015/10/21/chartex" xmlns:cx3="http://schemas.microsoft.com/office/drawing/2016/5/9/chartex" xmlns:cx4="http://schemas.microsoft.com/office/drawing/2016/5/10/chartex" xmlns:cx5="http://schemas.microsoft.com/office/drawing/2016/5/11/chartex" xmlns:cx6="http://schemas.microsoft.com/office/drawing/2016/5/12/chartex" xmlns:cx7="http://schemas.microsoft.com/office/drawing/2016/5/13/chartex" xmlns:cx8="http://schemas.microsoft.com/office/drawing/2016/5/14/chartex" xmlns:aink="http://schemas.microsoft.com/office/drawing/2016/ink" xmlns:am3d="http://schemas.microsoft.com/office/drawing/2017/model3d" xmlns:w16cex="http://schemas.microsoft.com/office/word/2018/wordml/cex" xmlns:w16cid="http://schemas.microsoft.com/office/word/2016/wordml/cid" xmlns:w16="http://schemas.microsoft.com/office/word/2018/wordml" xmlns:w16sdtdh="http://schemas.microsoft.com/office/word/2020/wordml/sdtdatahash" xmlns:w16se="http://schemas.microsoft.com/office/word/2015/wordml/symex" mc:Ignorable="w14 w15 wp14">
+<w:document xmlns:wpc="http://schemas.microsoft.com/office/word/2010/wordprocessingCanvas" xmlns:cx="http://schemas.microsoft.com/office/drawing/2014/chartex" xmlns:cx1="http://schemas.microsoft.com/office/drawing/2015/9/8/chartex" xmlns:cx2="http://schemas.microsoft.com/office/drawing/2015/10/21/chartex" xmlns:cx3="http://schemas.microsoft.com/office/drawing/2016/5/9/chartex" xmlns:cx4="http://schemas.microsoft.com/office/drawing/2016/5/10/chartex" xmlns:cx5="http://schemas.microsoft.com/office/drawing/2016/5/11/chartex" xmlns:cx6="http://schemas.microsoft.com/office/drawing/2016/5/12/chartex" xmlns:cx7="http://schemas.microsoft.com/office/drawing/2016/5/13/chartex" xmlns:cx8="http://schemas.microsoft.com/office/drawing/2016/5/14/chartex" xmlns:mc="http://schemas.openxmlformats.org/markup-compatibility/2006" xmlns:o="urn:schemas-microsoft-com:office:office" xmlns:r="http://schemas.openxmlformats.org/officeDocument/2006/relationships" xmlns:m="http://schemas.openxmlformats.org/officeDocument/2006/math" xmlns:v="urn:schemas-microsoft-com:vml" xmlns:wp14="http://schemas.microsoft.com/office/word/2010/wordprocessingDrawing" xmlns:wp="http://schemas.openxmlformats.org/drawingml/2006/wordprocessingDrawing" xmlns:w="http://schemas.openxmlformats.org/wordprocessingml/2006/main" xmlns:w14="http://schemas.microsoft.com/office/word/2010/wordml" xmlns:w10="urn:schemas-microsoft-com:office:word" xmlns:w15="http://schemas.microsoft.com/office/word/2012/wordml" xmlns:wpg="http://schemas.microsoft.com/office/word/2010/wordprocessingGroup" xmlns:wpi="http://schemas.microsoft.com/office/word/2010/wordprocessingInk" xmlns:wne="http://schemas.microsoft.com/office/word/2006/wordml" xmlns:wps="http://schemas.microsoft.com/office/word/2010/wordprocessingShape" xmlns:wpsCustomData="http://www.wps.cn/officeDocument/2013/wpsCustomData" mc:Ignorable="w14 w15 wp14">
   <w:body>
     <w:p>
       <w:pPr>
@@ -9,14 +9,14 @@
       </w:pPr>
       <w:r>
         <w:rPr>
-          <w:rFonts w:ascii="Calibri" w:cs="Calibri" w:eastAsia="Calibri" w:hAnsi="Calibri"/>
+          <w:rFonts w:ascii="Calibri" w:hAnsi="Calibri" w:eastAsia="Calibri" w:cs="Calibri"/>
           <w:b/>
           <w:bCs/>
           <w:color w:val="1F3864"/>
           <w:sz w:val="40"/>
           <w:szCs w:val="40"/>
         </w:rPr>
-        <w:t xml:space="preserve">SYED FIRAS PEERZADA</w:t>
+        <w:t>SYED FIRAS PEERZADA</w:t>
       </w:r>
     </w:p>
     <w:p>
@@ -30,7 +30,7 @@
           <w:sz w:val="22"/>
           <w:szCs w:val="22"/>
         </w:rPr>
-        <w:t xml:space="preserve">Full-Stack Developer — Frontend &amp; Mobile</w:t>
+        <w:t>Full-Stack Developer — Frontend &amp; Mobile</w:t>
       </w:r>
     </w:p>
     <w:p>
@@ -44,7 +44,34 @@
           <w:sz w:val="18"/>
           <w:szCs w:val="18"/>
         </w:rPr>
-        <w:t xml:space="preserve">Bhatkal, Karnataka, India</w:t>
+        <w:t xml:space="preserve">Bhatkal, Karnataka, India   |   </w:t>
+      </w:r>
+      <w:r>
+        <w:fldChar w:fldCharType="begin"/>
+      </w:r>
+      <w:r>
+        <w:instrText xml:space="preserve"> HYPERLINK "mailto:workwithfiras@gmail.com" </w:instrText>
+      </w:r>
+      <w:r>
+        <w:fldChar w:fldCharType="separate"/>
+      </w:r>
+      <w:r>
+        <w:rPr>
+          <w:color w:val="1F3864"/>
+          <w:sz w:val="18"/>
+          <w:szCs w:val="18"/>
+          <w:u w:val="single"/>
+        </w:rPr>
+        <w:t>workwithfiras@gmail.com</w:t>
+      </w:r>
+      <w:r>
+        <w:rPr>
+          <w:color w:val="1F3864"/>
+          <w:sz w:val="18"/>
+          <w:szCs w:val="18"/>
+          <w:u w:val="single"/>
+        </w:rPr>
+        <w:fldChar w:fldCharType="end"/>
       </w:r>
       <w:r>
         <w:rPr>
@@ -54,17 +81,33 @@
         </w:rPr>
         <w:t xml:space="preserve">   |   </w:t>
       </w:r>
-      <w:hyperlink w:history="1" r:id="rIdcgbzz5sbydsyykuu2kw9g">
-        <w:r>
-          <w:rPr>
-            <w:color w:val="1F3864"/>
-            <w:sz w:val="18"/>
-            <w:szCs w:val="18"/>
-            <w:u w:val="single"/>
-          </w:rPr>
-          <w:t xml:space="preserve">workwithfiras@gmail.com</w:t>
-        </w:r>
-      </w:hyperlink>
+      <w:r>
+        <w:fldChar w:fldCharType="begin"/>
+      </w:r>
+      <w:r>
+        <w:instrText xml:space="preserve"> HYPERLINK "https://linkedin.com/in/syedfiras7" </w:instrText>
+      </w:r>
+      <w:r>
+        <w:fldChar w:fldCharType="separate"/>
+      </w:r>
+      <w:r>
+        <w:rPr>
+          <w:color w:val="1F3864"/>
+          <w:sz w:val="18"/>
+          <w:szCs w:val="18"/>
+          <w:u w:val="single"/>
+        </w:rPr>
+        <w:t>linkedin.com/in/syedfiras7</w:t>
+      </w:r>
+      <w:r>
+        <w:rPr>
+          <w:color w:val="1F3864"/>
+          <w:sz w:val="18"/>
+          <w:szCs w:val="18"/>
+          <w:u w:val="single"/>
+        </w:rPr>
+        <w:fldChar w:fldCharType="end"/>
+      </w:r>
       <w:r>
         <w:rPr>
           <w:color w:val="555555"/>
@@ -73,17 +116,33 @@
         </w:rPr>
         <w:t xml:space="preserve">   |   </w:t>
       </w:r>
-      <w:hyperlink w:history="1" r:id="rIddqaubc3dmzl8307p1ivsg">
-        <w:r>
-          <w:rPr>
-            <w:color w:val="1F3864"/>
-            <w:sz w:val="18"/>
-            <w:szCs w:val="18"/>
-            <w:u w:val="single"/>
-          </w:rPr>
-          <w:t xml:space="preserve">linkedin.com/in/syedfiras7</w:t>
-        </w:r>
-      </w:hyperlink>
+      <w:r>
+        <w:fldChar w:fldCharType="begin"/>
+      </w:r>
+      <w:r>
+        <w:instrText xml:space="preserve"> HYPERLINK "https://github.com/syedfiras" </w:instrText>
+      </w:r>
+      <w:r>
+        <w:fldChar w:fldCharType="separate"/>
+      </w:r>
+      <w:r>
+        <w:rPr>
+          <w:color w:val="1F3864"/>
+          <w:sz w:val="18"/>
+          <w:szCs w:val="18"/>
+          <w:u w:val="single"/>
+        </w:rPr>
+        <w:t>github.com/syedfiras</w:t>
+      </w:r>
+      <w:r>
+        <w:rPr>
+          <w:color w:val="1F3864"/>
+          <w:sz w:val="18"/>
+          <w:szCs w:val="18"/>
+          <w:u w:val="single"/>
+        </w:rPr>
+        <w:fldChar w:fldCharType="end"/>
+      </w:r>
       <w:r>
         <w:rPr>
           <w:color w:val="555555"/>
@@ -92,54 +151,51 @@
         </w:rPr>
         <w:t xml:space="preserve">   |   </w:t>
       </w:r>
-      <w:hyperlink w:history="1" r:id="rIdxlx7kqazb47vzqjugzpcr">
-        <w:r>
-          <w:rPr>
-            <w:color w:val="1F3864"/>
-            <w:sz w:val="18"/>
-            <w:szCs w:val="18"/>
-            <w:u w:val="single"/>
-          </w:rPr>
-          <w:t xml:space="preserve">github.com/syedfiras</w:t>
-        </w:r>
-      </w:hyperlink>
-      <w:r>
-        <w:rPr>
-          <w:color w:val="555555"/>
+      <w:r>
+        <w:fldChar w:fldCharType="begin"/>
+      </w:r>
+      <w:r>
+        <w:instrText xml:space="preserve"> HYPERLINK "https://syedfiras.dev" </w:instrText>
+      </w:r>
+      <w:r>
+        <w:fldChar w:fldCharType="separate"/>
+      </w:r>
+      <w:r>
+        <w:rPr>
+          <w:color w:val="1F3864"/>
           <w:sz w:val="18"/>
           <w:szCs w:val="18"/>
-        </w:rPr>
-        <w:t xml:space="preserve">   |   </w:t>
-      </w:r>
-      <w:hyperlink w:history="1" r:id="rIdj1mtkv6quksaodvjhpdcp">
-        <w:r>
-          <w:rPr>
-            <w:color w:val="1F3864"/>
-            <w:sz w:val="18"/>
-            <w:szCs w:val="18"/>
-            <w:u w:val="single"/>
-          </w:rPr>
-          <w:t xml:space="preserve">syedfiras.dev</w:t>
-        </w:r>
-      </w:hyperlink>
+          <w:u w:val="single"/>
+        </w:rPr>
+        <w:t>syedfiras.dev</w:t>
+      </w:r>
+      <w:r>
+        <w:rPr>
+          <w:color w:val="1F3864"/>
+          <w:sz w:val="18"/>
+          <w:szCs w:val="18"/>
+          <w:u w:val="single"/>
+        </w:rPr>
+        <w:fldChar w:fldCharType="end"/>
+      </w:r>
     </w:p>
     <w:p>
       <w:pPr>
         <w:pBdr>
           <w:bottom w:val="single" w:color="1F3864" w:sz="6" w:space="4"/>
         </w:pBdr>
-        <w:spacing w:after="60" w:before="160"/>
-      </w:pPr>
-      <w:r>
-        <w:rPr>
-          <w:rFonts w:ascii="Calibri" w:cs="Calibri" w:eastAsia="Calibri" w:hAnsi="Calibri"/>
+        <w:spacing w:before="160" w:after="60"/>
+      </w:pPr>
+      <w:r>
+        <w:rPr>
+          <w:rFonts w:ascii="Calibri" w:hAnsi="Calibri" w:eastAsia="Calibri" w:cs="Calibri"/>
           <w:b/>
           <w:bCs/>
           <w:color w:val="1F3864"/>
           <w:sz w:val="21"/>
           <w:szCs w:val="21"/>
         </w:rPr>
-        <w:t xml:space="preserve">PROFESSIONAL SUMMARY</w:t>
+        <w:t>PROFESSIONAL SUMMARY</w:t>
       </w:r>
     </w:p>
     <w:p>
@@ -152,7 +208,7 @@
           <w:sz w:val="20"/>
           <w:szCs w:val="20"/>
         </w:rPr>
-        <w:t xml:space="preserve">Full-stack developer and CS undergraduate (B.Tech, expected 2028) with hands-on experience shipping production features across two startup internships, an ongoing SDE internship, and freelance client work. Builds end-to-end across React, React Native, Next.js, Angular/Ionic, Node.js, and Supabase — including a live production platform, a school management system, an AI-matching tool, and a paid client gym-management app. Fast learner who ships quickly in small, high-velocity teams.</w:t>
+        <w:t>Full-stack developer and CS undergraduate (B.Tech, expected 2028) with hands-on experience shipping production features across two startup internships, an ongoing SDE internship, and freelance client work. Builds end-to-end across React, React Native, Next.js, Angular/Ionic, Node.js, and Supabase — including a live production platform, a school management system, an AI-matching tool, and a paid client gym-management app. Fast learner who ships quickly in small, high-velocity teams.</w:t>
       </w:r>
     </w:p>
     <w:p>
@@ -160,18 +216,18 @@
         <w:pBdr>
           <w:bottom w:val="single" w:color="1F3864" w:sz="6" w:space="4"/>
         </w:pBdr>
-        <w:spacing w:after="60" w:before="160"/>
-      </w:pPr>
-      <w:r>
-        <w:rPr>
-          <w:rFonts w:ascii="Calibri" w:cs="Calibri" w:eastAsia="Calibri" w:hAnsi="Calibri"/>
+        <w:spacing w:before="160" w:after="60"/>
+      </w:pPr>
+      <w:r>
+        <w:rPr>
+          <w:rFonts w:ascii="Calibri" w:hAnsi="Calibri" w:eastAsia="Calibri" w:cs="Calibri"/>
           <w:b/>
           <w:bCs/>
           <w:color w:val="1F3864"/>
           <w:sz w:val="21"/>
           <w:szCs w:val="21"/>
         </w:rPr>
-        <w:t xml:space="preserve">TECHNICAL SKILLS</w:t>
+        <w:t>TECHNICAL SKILLS</w:t>
       </w:r>
     </w:p>
     <w:p>
@@ -194,7 +250,7 @@
           <w:sz w:val="20"/>
           <w:szCs w:val="20"/>
         </w:rPr>
-        <w:t xml:space="preserve">JavaScript, TypeScript, HTML/CSS</w:t>
+        <w:t>JavaScript, TypeScript, HTML/CSS</w:t>
       </w:r>
     </w:p>
     <w:p>
@@ -217,7 +273,7 @@
           <w:sz w:val="20"/>
           <w:szCs w:val="20"/>
         </w:rPr>
-        <w:t xml:space="preserve">React.js, Next.js, Angular, Ionic, Tailwind CSS, NativeWind, Vite</w:t>
+        <w:t>React.js, Next.js, Angular, Ionic, Tailwind CSS, NativeWind, Vite</w:t>
       </w:r>
     </w:p>
     <w:p>
@@ -240,7 +296,7 @@
           <w:sz w:val="20"/>
           <w:szCs w:val="20"/>
         </w:rPr>
-        <w:t xml:space="preserve">React Native, Expo, iOS/Android</w:t>
+        <w:t>React Native, Expo, iOS/Android</w:t>
       </w:r>
     </w:p>
     <w:p>
@@ -263,7 +319,7 @@
           <w:sz w:val="20"/>
           <w:szCs w:val="20"/>
         </w:rPr>
-        <w:t xml:space="preserve">Node.js, Express, Supabase (PostgreSQL, Auth, Realtime)</w:t>
+        <w:t>Node.js, Express, Supabase (PostgreSQL, Auth, Realtime)</w:t>
       </w:r>
     </w:p>
     <w:p>
@@ -286,7 +342,7 @@
           <w:sz w:val="20"/>
           <w:szCs w:val="20"/>
         </w:rPr>
-        <w:t xml:space="preserve">Git, VS Code, Vercel, Netlify, Render, Stripe API, WebSockets</w:t>
+        <w:t>Git, VS Code, Vercel, Netlify, Render, Stripe API, WebSockets</w:t>
       </w:r>
     </w:p>
     <w:p>
@@ -294,18 +350,18 @@
         <w:pBdr>
           <w:bottom w:val="single" w:color="1F3864" w:sz="6" w:space="4"/>
         </w:pBdr>
-        <w:spacing w:after="60" w:before="160"/>
-      </w:pPr>
-      <w:r>
-        <w:rPr>
-          <w:rFonts w:ascii="Calibri" w:cs="Calibri" w:eastAsia="Calibri" w:hAnsi="Calibri"/>
+        <w:spacing w:before="160" w:after="60"/>
+      </w:pPr>
+      <w:r>
+        <w:rPr>
+          <w:rFonts w:ascii="Calibri" w:hAnsi="Calibri" w:eastAsia="Calibri" w:cs="Calibri"/>
           <w:b/>
           <w:bCs/>
           <w:color w:val="1F3864"/>
           <w:sz w:val="21"/>
           <w:szCs w:val="21"/>
         </w:rPr>
-        <w:t xml:space="preserve">EXPERIENCE</w:t>
+        <w:t>EXPERIENCE</w:t>
       </w:r>
     </w:p>
     <w:p>
@@ -313,7 +369,7 @@
         <w:tabs>
           <w:tab w:val="right" w:pos="9360"/>
         </w:tabs>
-        <w:spacing w:after="15" w:before="80"/>
+        <w:spacing w:before="80" w:after="15"/>
       </w:pPr>
       <w:r>
         <w:rPr>
@@ -323,7 +379,7 @@
           <w:sz w:val="21"/>
           <w:szCs w:val="21"/>
         </w:rPr>
-        <w:t xml:space="preserve">SDE Intern</w:t>
+        <w:t>SDE Intern</w:t>
       </w:r>
       <w:r>
         <w:rPr>
@@ -341,12 +397,13 @@
           <w:sz w:val="19"/>
           <w:szCs w:val="19"/>
         </w:rPr>
-        <w:t xml:space="preserve">	Jul 2026 – Present</w:t>
-      </w:r>
-    </w:p>
-    <w:p>
-      <w:pPr>
-        <w:pStyle w:val="ListParagraph"/>
+        <w:tab/>
+        <w:t>Jul 2026 – Present</w:t>
+      </w:r>
+    </w:p>
+    <w:p>
+      <w:pPr>
+        <w:pStyle w:val="16"/>
         <w:numPr>
           <w:ilvl w:val="0"/>
           <w:numId w:val="1"/>
@@ -360,12 +417,12 @@
           <w:sz w:val="20"/>
           <w:szCs w:val="20"/>
         </w:rPr>
-        <w:t xml:space="preserve">Built and shipped Interiora Studio, a production interior design management platform combining authentication, project management, and a responsive Tailwind CSS interface, deployed on Vercel.</w:t>
-      </w:r>
-    </w:p>
-    <w:p>
-      <w:pPr>
-        <w:pStyle w:val="ListParagraph"/>
+        <w:t>Built and shipped Interiora Studio, a production interior design management platform combining authentication, project management, and a responsive Tailwind CSS interface, deployed on Vercel.</w:t>
+      </w:r>
+    </w:p>
+    <w:p>
+      <w:pPr>
+        <w:pStyle w:val="16"/>
         <w:numPr>
           <w:ilvl w:val="0"/>
           <w:numId w:val="1"/>
@@ -379,7 +436,7 @@
           <w:sz w:val="20"/>
           <w:szCs w:val="20"/>
         </w:rPr>
-        <w:t xml:space="preserve">Currently extending platform features and internal tooling used by the design team.</w:t>
+        <w:t>Currently extending platform features and internal tooling used by the design team.</w:t>
       </w:r>
     </w:p>
     <w:p>
@@ -387,7 +444,7 @@
         <w:tabs>
           <w:tab w:val="right" w:pos="9360"/>
         </w:tabs>
-        <w:spacing w:after="15" w:before="80"/>
+        <w:spacing w:before="80" w:after="15"/>
       </w:pPr>
       <w:r>
         <w:rPr>
@@ -397,7 +454,7 @@
           <w:sz w:val="21"/>
           <w:szCs w:val="21"/>
         </w:rPr>
-        <w:t xml:space="preserve">Frontend Developer</w:t>
+        <w:t>Frontend Developer</w:t>
       </w:r>
       <w:r>
         <w:rPr>
@@ -415,12 +472,13 @@
           <w:sz w:val="19"/>
           <w:szCs w:val="19"/>
         </w:rPr>
-        <w:t xml:space="preserve">	4 months</w:t>
-      </w:r>
-    </w:p>
-    <w:p>
-      <w:pPr>
-        <w:pStyle w:val="ListParagraph"/>
+        <w:tab/>
+        <w:t>4 months</w:t>
+      </w:r>
+    </w:p>
+    <w:p>
+      <w:pPr>
+        <w:pStyle w:val="16"/>
         <w:numPr>
           <w:ilvl w:val="0"/>
           <w:numId w:val="1"/>
@@ -434,12 +492,12 @@
           <w:sz w:val="20"/>
           <w:szCs w:val="20"/>
         </w:rPr>
-        <w:t xml:space="preserve">Built core modules of a school management system handling student records, attendance, and administrative workflows.</w:t>
-      </w:r>
-    </w:p>
-    <w:p>
-      <w:pPr>
-        <w:pStyle w:val="ListParagraph"/>
+        <w:t>Built core modules of a school management system handling student records, attendance, and administrative workflows.</w:t>
+      </w:r>
+    </w:p>
+    <w:p>
+      <w:pPr>
+        <w:pStyle w:val="16"/>
         <w:numPr>
           <w:ilvl w:val="0"/>
           <w:numId w:val="1"/>
@@ -453,12 +511,12 @@
           <w:sz w:val="20"/>
           <w:szCs w:val="20"/>
         </w:rPr>
-        <w:t xml:space="preserve">Translated product requirements into responsive, production-ready UI components in direct collaboration with the product and engineering team.</w:t>
-      </w:r>
-    </w:p>
-    <w:p>
-      <w:pPr>
-        <w:pStyle w:val="ListParagraph"/>
+        <w:t>Translated product requirements into responsive, production-ready UI components in direct collaboration with the product and engineering team.</w:t>
+      </w:r>
+    </w:p>
+    <w:p>
+      <w:pPr>
+        <w:pStyle w:val="16"/>
         <w:numPr>
           <w:ilvl w:val="0"/>
           <w:numId w:val="1"/>
@@ -472,7 +530,7 @@
           <w:sz w:val="20"/>
           <w:szCs w:val="20"/>
         </w:rPr>
-        <w:t xml:space="preserve">Debugged, optimized, and shipped features across the frontend stack under real release timelines.</w:t>
+        <w:t>Debugged, optimized, and shipped features across the frontend stack under real release timelines.</w:t>
       </w:r>
     </w:p>
     <w:p>
@@ -480,7 +538,7 @@
         <w:tabs>
           <w:tab w:val="right" w:pos="9360"/>
         </w:tabs>
-        <w:spacing w:after="15" w:before="80"/>
+        <w:spacing w:before="80" w:after="15"/>
       </w:pPr>
       <w:r>
         <w:rPr>
@@ -490,7 +548,7 @@
           <w:sz w:val="21"/>
           <w:szCs w:val="21"/>
         </w:rPr>
-        <w:t xml:space="preserve">Frontend Developer</w:t>
+        <w:t>Frontend Developer</w:t>
       </w:r>
       <w:r>
         <w:rPr>
@@ -508,12 +566,13 @@
           <w:sz w:val="19"/>
           <w:szCs w:val="19"/>
         </w:rPr>
-        <w:t xml:space="preserve">	2 months</w:t>
-      </w:r>
-    </w:p>
-    <w:p>
-      <w:pPr>
-        <w:pStyle w:val="ListParagraph"/>
+        <w:tab/>
+        <w:t>2 months</w:t>
+      </w:r>
+    </w:p>
+    <w:p>
+      <w:pPr>
+        <w:pStyle w:val="16"/>
         <w:numPr>
           <w:ilvl w:val="0"/>
           <w:numId w:val="1"/>
@@ -527,12 +586,12 @@
           <w:sz w:val="20"/>
           <w:szCs w:val="20"/>
         </w:rPr>
-        <w:t xml:space="preserve">Built frontend features for an AI-powered platform matching students with relevant internships.</w:t>
-      </w:r>
-    </w:p>
-    <w:p>
-      <w:pPr>
-        <w:pStyle w:val="ListParagraph"/>
+        <w:t>Built frontend features for an AI-powered platform matching students with relevant internships.</w:t>
+      </w:r>
+    </w:p>
+    <w:p>
+      <w:pPr>
+        <w:pStyle w:val="16"/>
         <w:numPr>
           <w:ilvl w:val="0"/>
           <w:numId w:val="1"/>
@@ -546,7 +605,7 @@
           <w:sz w:val="20"/>
           <w:szCs w:val="20"/>
         </w:rPr>
-        <w:t xml:space="preserve">Implemented UI for AI-driven recommendation flows, iterating quickly with a small team on product feedback.</w:t>
+        <w:t>Implemented UI for AI-driven recommendation flows, iterating quickly with a small team on product feedback.</w:t>
       </w:r>
     </w:p>
     <w:p>
@@ -554,7 +613,7 @@
         <w:tabs>
           <w:tab w:val="right" w:pos="9360"/>
         </w:tabs>
-        <w:spacing w:after="15" w:before="80"/>
+        <w:spacing w:before="80" w:after="15"/>
       </w:pPr>
       <w:r>
         <w:rPr>
@@ -564,7 +623,7 @@
           <w:sz w:val="21"/>
           <w:szCs w:val="21"/>
         </w:rPr>
-        <w:t xml:space="preserve">Freelance Developer</w:t>
+        <w:t>Freelance Developer</w:t>
       </w:r>
       <w:r>
         <w:rPr>
@@ -582,12 +641,13 @@
           <w:sz w:val="19"/>
           <w:szCs w:val="19"/>
         </w:rPr>
-        <w:t xml:space="preserve">	Ongoing</w:t>
-      </w:r>
-    </w:p>
-    <w:p>
-      <w:pPr>
-        <w:pStyle w:val="ListParagraph"/>
+        <w:tab/>
+        <w:t>Ongoing</w:t>
+      </w:r>
+    </w:p>
+    <w:p>
+      <w:pPr>
+        <w:pStyle w:val="16"/>
         <w:numPr>
           <w:ilvl w:val="0"/>
           <w:numId w:val="1"/>
@@ -601,12 +661,12 @@
           <w:sz w:val="20"/>
           <w:szCs w:val="20"/>
         </w:rPr>
-        <w:t xml:space="preserve">Designed and built a gym management app end-to-end for a paying client — member tracking, scheduling, and an admin dashboard — using Ionic, Angular, Node.js, and Supabase.</w:t>
-      </w:r>
-    </w:p>
-    <w:p>
-      <w:pPr>
-        <w:pStyle w:val="ListParagraph"/>
+        <w:t>Designed and built a gym management app end-to-end for a paying client — member tracking, scheduling, and an admin dashboard — using Ionic, Angular, Node.js, and Supabase.</w:t>
+      </w:r>
+    </w:p>
+    <w:p>
+      <w:pPr>
+        <w:pStyle w:val="16"/>
         <w:numPr>
           <w:ilvl w:val="0"/>
           <w:numId w:val="1"/>
@@ -620,7 +680,7 @@
           <w:sz w:val="20"/>
           <w:szCs w:val="20"/>
         </w:rPr>
-        <w:t xml:space="preserve">Owned the project as sole developer from requirements gathering through deployment, managing a live client relationship and production data.</w:t>
+        <w:t>Owned the project as sole developer from requirements gathering through deployment, managing a live client relationship and production data.</w:t>
       </w:r>
     </w:p>
     <w:p>
@@ -628,23 +688,23 @@
         <w:pBdr>
           <w:bottom w:val="single" w:color="1F3864" w:sz="6" w:space="4"/>
         </w:pBdr>
-        <w:spacing w:after="60" w:before="160"/>
-      </w:pPr>
-      <w:r>
-        <w:rPr>
-          <w:rFonts w:ascii="Calibri" w:cs="Calibri" w:eastAsia="Calibri" w:hAnsi="Calibri"/>
+        <w:spacing w:before="160" w:after="60"/>
+      </w:pPr>
+      <w:r>
+        <w:rPr>
+          <w:rFonts w:ascii="Calibri" w:hAnsi="Calibri" w:eastAsia="Calibri" w:cs="Calibri"/>
           <w:b/>
           <w:bCs/>
           <w:color w:val="1F3864"/>
           <w:sz w:val="21"/>
           <w:szCs w:val="21"/>
         </w:rPr>
-        <w:t xml:space="preserve">PROJECTS</w:t>
-      </w:r>
-    </w:p>
-    <w:p>
-      <w:pPr>
-        <w:spacing w:after="15" w:before="70"/>
+        <w:t>PROJECTS</w:t>
+      </w:r>
+    </w:p>
+    <w:p>
+      <w:pPr>
+        <w:spacing w:before="70" w:after="15"/>
       </w:pPr>
       <w:r>
         <w:rPr>
@@ -654,7 +714,7 @@
           <w:sz w:val="21"/>
           <w:szCs w:val="21"/>
         </w:rPr>
-        <w:t xml:space="preserve">Interiora Studio</w:t>
+        <w:t>Interiora Studio</w:t>
       </w:r>
       <w:r>
         <w:rPr>
@@ -674,21 +734,37 @@
         </w:rPr>
         <w:t xml:space="preserve">  |  </w:t>
       </w:r>
-      <w:hyperlink w:history="1" r:id="rIdvopei-ghbtor_hbyrfop2">
-        <w:r>
-          <w:rPr>
-            <w:color w:val="1F3864"/>
-            <w:sz w:val="19"/>
-            <w:szCs w:val="19"/>
-            <w:u w:val="single"/>
-          </w:rPr>
-          <w:t xml:space="preserve">Live Demo</w:t>
-        </w:r>
-      </w:hyperlink>
-    </w:p>
-    <w:p>
-      <w:pPr>
-        <w:pStyle w:val="ListParagraph"/>
+      <w:r>
+        <w:fldChar w:fldCharType="begin"/>
+      </w:r>
+      <w:r>
+        <w:instrText xml:space="preserve"> HYPERLINK "https://interior-swart-nine.vercel.app/login" </w:instrText>
+      </w:r>
+      <w:r>
+        <w:fldChar w:fldCharType="separate"/>
+      </w:r>
+      <w:r>
+        <w:rPr>
+          <w:color w:val="1F3864"/>
+          <w:sz w:val="19"/>
+          <w:szCs w:val="19"/>
+          <w:u w:val="single"/>
+        </w:rPr>
+        <w:t>Live Demo</w:t>
+      </w:r>
+      <w:r>
+        <w:rPr>
+          <w:color w:val="1F3864"/>
+          <w:sz w:val="19"/>
+          <w:szCs w:val="19"/>
+          <w:u w:val="single"/>
+        </w:rPr>
+        <w:fldChar w:fldCharType="end"/>
+      </w:r>
+    </w:p>
+    <w:p>
+      <w:pPr>
+        <w:pStyle w:val="16"/>
         <w:numPr>
           <w:ilvl w:val="0"/>
           <w:numId w:val="1"/>
@@ -702,12 +778,12 @@
           <w:sz w:val="20"/>
           <w:szCs w:val="20"/>
         </w:rPr>
-        <w:t xml:space="preserve">Full-stack interior design management platform with authentication, project management, and a polished, production-ready UI.</w:t>
-      </w:r>
-    </w:p>
-    <w:p>
-      <w:pPr>
-        <w:spacing w:after="15" w:before="70"/>
+        <w:t>Full-stack interior design management platform with authentication, project management, and a polished, production-ready UI.</w:t>
+      </w:r>
+    </w:p>
+    <w:p>
+      <w:pPr>
+        <w:spacing w:before="70" w:after="15"/>
       </w:pPr>
       <w:r>
         <w:rPr>
@@ -717,7 +793,7 @@
           <w:sz w:val="21"/>
           <w:szCs w:val="21"/>
         </w:rPr>
-        <w:t xml:space="preserve">GymNet Solutions Portal</w:t>
+        <w:t>GymNet Solutions Portal</w:t>
       </w:r>
       <w:r>
         <w:rPr>
@@ -737,21 +813,37 @@
         </w:rPr>
         <w:t xml:space="preserve">  |  </w:t>
       </w:r>
-      <w:hyperlink w:history="1" r:id="rIdbgfq9vbwngolhvq-fizlr">
-        <w:r>
-          <w:rPr>
-            <w:color w:val="1F3864"/>
-            <w:sz w:val="19"/>
-            <w:szCs w:val="19"/>
-            <w:u w:val="single"/>
-          </w:rPr>
-          <w:t xml:space="preserve">Live Demo</w:t>
-        </w:r>
-      </w:hyperlink>
-    </w:p>
-    <w:p>
-      <w:pPr>
-        <w:pStyle w:val="ListParagraph"/>
+      <w:r>
+        <w:fldChar w:fldCharType="begin"/>
+      </w:r>
+      <w:r>
+        <w:instrText xml:space="preserve"> HYPERLINK "https://gymnetsolutions.netlify.app/" </w:instrText>
+      </w:r>
+      <w:r>
+        <w:fldChar w:fldCharType="separate"/>
+      </w:r>
+      <w:r>
+        <w:rPr>
+          <w:color w:val="1F3864"/>
+          <w:sz w:val="19"/>
+          <w:szCs w:val="19"/>
+          <w:u w:val="single"/>
+        </w:rPr>
+        <w:t>Live Demo</w:t>
+      </w:r>
+      <w:r>
+        <w:rPr>
+          <w:color w:val="1F3864"/>
+          <w:sz w:val="19"/>
+          <w:szCs w:val="19"/>
+          <w:u w:val="single"/>
+        </w:rPr>
+        <w:fldChar w:fldCharType="end"/>
+      </w:r>
+    </w:p>
+    <w:p>
+      <w:pPr>
+        <w:pStyle w:val="16"/>
         <w:numPr>
           <w:ilvl w:val="0"/>
           <w:numId w:val="1"/>
@@ -765,12 +857,12 @@
           <w:sz w:val="20"/>
           <w:szCs w:val="20"/>
         </w:rPr>
-        <w:t xml:space="preserve">Gym management platform with member tracking, automated PDF invoice generation, an interactive class scheduler, and trainer planning tools backed by a real-time Supabase database.</w:t>
-      </w:r>
-    </w:p>
-    <w:p>
-      <w:pPr>
-        <w:spacing w:after="15" w:before="70"/>
+        <w:t>Gym management platform with member tracking, automated PDF invoice generation, an interactive class scheduler, and trainer planning tools backed by a real-time Supabase database.</w:t>
+      </w:r>
+    </w:p>
+    <w:p>
+      <w:pPr>
+        <w:spacing w:before="70" w:after="15"/>
       </w:pPr>
       <w:r>
         <w:rPr>
@@ -780,7 +872,7 @@
           <w:sz w:val="21"/>
           <w:szCs w:val="21"/>
         </w:rPr>
-        <w:t xml:space="preserve">Auction Football System</w:t>
+        <w:t>Auction Football System</w:t>
       </w:r>
       <w:r>
         <w:rPr>
@@ -800,21 +892,37 @@
         </w:rPr>
         <w:t xml:space="preserve">  |  </w:t>
       </w:r>
-      <w:hyperlink w:history="1" r:id="rId7gyv0uhtjnegu2zwslb44">
-        <w:r>
-          <w:rPr>
-            <w:color w:val="1F3864"/>
-            <w:sz w:val="19"/>
-            <w:szCs w:val="19"/>
-            <w:u w:val="single"/>
-          </w:rPr>
-          <w:t xml:space="preserve">Live Demo</w:t>
-        </w:r>
-      </w:hyperlink>
-    </w:p>
-    <w:p>
-      <w:pPr>
-        <w:pStyle w:val="ListParagraph"/>
+      <w:r>
+        <w:fldChar w:fldCharType="begin"/>
+      </w:r>
+      <w:r>
+        <w:instrText xml:space="preserve"> HYPERLINK "https://auction-six-virid.vercel.app/login" </w:instrText>
+      </w:r>
+      <w:r>
+        <w:fldChar w:fldCharType="separate"/>
+      </w:r>
+      <w:r>
+        <w:rPr>
+          <w:color w:val="1F3864"/>
+          <w:sz w:val="19"/>
+          <w:szCs w:val="19"/>
+          <w:u w:val="single"/>
+        </w:rPr>
+        <w:t>Live Demo</w:t>
+      </w:r>
+      <w:r>
+        <w:rPr>
+          <w:color w:val="1F3864"/>
+          <w:sz w:val="19"/>
+          <w:szCs w:val="19"/>
+          <w:u w:val="single"/>
+        </w:rPr>
+        <w:fldChar w:fldCharType="end"/>
+      </w:r>
+    </w:p>
+    <w:p>
+      <w:pPr>
+        <w:pStyle w:val="16"/>
         <w:numPr>
           <w:ilvl w:val="0"/>
           <w:numId w:val="1"/>
@@ -828,12 +936,12 @@
           <w:sz w:val="20"/>
           <w:szCs w:val="20"/>
         </w:rPr>
-        <w:t xml:space="preserve">Real-time auction platform for football clubs to bid on player transfers, with countdown-timer bidding, Stripe payments, and live WebSocket notifications.</w:t>
-      </w:r>
-    </w:p>
-    <w:p>
-      <w:pPr>
-        <w:spacing w:after="15" w:before="70"/>
+        <w:t>Real-time auction platform for football clubs to bid on player transfers, with countdown-timer bidding, Stripe payments, and live WebSocket notifications.</w:t>
+      </w:r>
+    </w:p>
+    <w:p>
+      <w:pPr>
+        <w:spacing w:before="70" w:after="15"/>
       </w:pPr>
       <w:r>
         <w:rPr>
@@ -843,7 +951,7 @@
           <w:sz w:val="21"/>
           <w:szCs w:val="21"/>
         </w:rPr>
-        <w:t xml:space="preserve">BIFA Football Club Manager</w:t>
+        <w:t>BIFA Football Club Manager</w:t>
       </w:r>
       <w:r>
         <w:rPr>
@@ -863,21 +971,37 @@
         </w:rPr>
         <w:t xml:space="preserve">  |  </w:t>
       </w:r>
-      <w:hyperlink w:history="1" r:id="rId1omjqrwoifb4lkpcvw1lu">
-        <w:r>
-          <w:rPr>
-            <w:color w:val="1F3864"/>
-            <w:sz w:val="19"/>
-            <w:szCs w:val="19"/>
-            <w:u w:val="single"/>
-          </w:rPr>
-          <w:t xml:space="preserve">Live Demo</w:t>
-        </w:r>
-      </w:hyperlink>
-    </w:p>
-    <w:p>
-      <w:pPr>
-        <w:pStyle w:val="ListParagraph"/>
+      <w:r>
+        <w:fldChar w:fldCharType="begin"/>
+      </w:r>
+      <w:r>
+        <w:instrText xml:space="preserve"> HYPERLINK "https://bifa-registration-portal.netlify.app/" </w:instrText>
+      </w:r>
+      <w:r>
+        <w:fldChar w:fldCharType="separate"/>
+      </w:r>
+      <w:r>
+        <w:rPr>
+          <w:color w:val="1F3864"/>
+          <w:sz w:val="19"/>
+          <w:szCs w:val="19"/>
+          <w:u w:val="single"/>
+        </w:rPr>
+        <w:t>Live Demo</w:t>
+      </w:r>
+      <w:r>
+        <w:rPr>
+          <w:color w:val="1F3864"/>
+          <w:sz w:val="19"/>
+          <w:szCs w:val="19"/>
+          <w:u w:val="single"/>
+        </w:rPr>
+        <w:fldChar w:fldCharType="end"/>
+      </w:r>
+    </w:p>
+    <w:p>
+      <w:pPr>
+        <w:pStyle w:val="16"/>
         <w:numPr>
           <w:ilvl w:val="0"/>
           <w:numId w:val="1"/>
@@ -891,7 +1015,7 @@
           <w:sz w:val="20"/>
           <w:szCs w:val="20"/>
         </w:rPr>
-        <w:t xml:space="preserve">Team management system with a real-time player registration portal, dynamic match scheduling, and role-based admin dashboards.</w:t>
+        <w:t>Team management system with a real-time player registration portal, dynamic match scheduling, and role-based admin dashboards.</w:t>
       </w:r>
     </w:p>
     <w:p>
@@ -899,18 +1023,18 @@
         <w:pBdr>
           <w:bottom w:val="single" w:color="1F3864" w:sz="6" w:space="4"/>
         </w:pBdr>
-        <w:spacing w:after="60" w:before="160"/>
-      </w:pPr>
-      <w:r>
-        <w:rPr>
-          <w:rFonts w:ascii="Calibri" w:cs="Calibri" w:eastAsia="Calibri" w:hAnsi="Calibri"/>
+        <w:spacing w:before="160" w:after="60"/>
+      </w:pPr>
+      <w:r>
+        <w:rPr>
+          <w:rFonts w:ascii="Calibri" w:hAnsi="Calibri" w:eastAsia="Calibri" w:cs="Calibri"/>
           <w:b/>
           <w:bCs/>
           <w:color w:val="1F3864"/>
           <w:sz w:val="21"/>
           <w:szCs w:val="21"/>
         </w:rPr>
-        <w:t xml:space="preserve">EDUCATION</w:t>
+        <w:t>EDUCATION</w:t>
       </w:r>
     </w:p>
     <w:p>
@@ -923,7 +1047,7 @@
           <w:sz w:val="20"/>
           <w:szCs w:val="20"/>
         </w:rPr>
-        <w:t xml:space="preserve">B.Tech. Computer Science — Expected 2028</w:t>
+        <w:t>B.Tech. Computer Science — Expected 2028</w:t>
       </w:r>
     </w:p>
     <w:p>
@@ -931,23 +1055,23 @@
         <w:pBdr>
           <w:bottom w:val="single" w:color="1F3864" w:sz="6" w:space="4"/>
         </w:pBdr>
-        <w:spacing w:after="60" w:before="160"/>
-      </w:pPr>
-      <w:r>
-        <w:rPr>
-          <w:rFonts w:ascii="Calibri" w:cs="Calibri" w:eastAsia="Calibri" w:hAnsi="Calibri"/>
+        <w:spacing w:before="160" w:after="60"/>
+      </w:pPr>
+      <w:r>
+        <w:rPr>
+          <w:rFonts w:ascii="Calibri" w:hAnsi="Calibri" w:eastAsia="Calibri" w:cs="Calibri"/>
           <w:b/>
           <w:bCs/>
           <w:color w:val="1F3864"/>
           <w:sz w:val="21"/>
           <w:szCs w:val="21"/>
         </w:rPr>
-        <w:t xml:space="preserve">CERTIFICATIONS &amp; ACHIEVEMENTS</w:t>
-      </w:r>
-    </w:p>
-    <w:p>
-      <w:pPr>
-        <w:pStyle w:val="ListParagraph"/>
+        <w:t>CERTIFICATIONS &amp; ACHIEVEMENTS</w:t>
+      </w:r>
+    </w:p>
+    <w:p>
+      <w:pPr>
+        <w:pStyle w:val="16"/>
         <w:numPr>
           <w:ilvl w:val="0"/>
           <w:numId w:val="1"/>
@@ -961,12 +1085,12 @@
           <w:sz w:val="20"/>
           <w:szCs w:val="20"/>
         </w:rPr>
-        <w:t xml:space="preserve">AIFF Certified Referee — Certified by the All India Football Federation.</w:t>
-      </w:r>
-    </w:p>
-    <w:p>
-      <w:pPr>
-        <w:pStyle w:val="ListParagraph"/>
+        <w:t>AIFF Certified Referee — Certified by the All India Football Federation.</w:t>
+      </w:r>
+    </w:p>
+    <w:p>
+      <w:pPr>
+        <w:pStyle w:val="16"/>
         <w:numPr>
           <w:ilvl w:val="0"/>
           <w:numId w:val="1"/>
@@ -980,12 +1104,12 @@
           <w:sz w:val="20"/>
           <w:szCs w:val="20"/>
         </w:rPr>
-        <w:t xml:space="preserve">4× State-Level Football Player — represented at state level across four tournaments.</w:t>
-      </w:r>
-    </w:p>
-    <w:p>
-      <w:pPr>
-        <w:pStyle w:val="ListParagraph"/>
+        <w:t>4× State-Level Football Player — represented at state level across four tournaments.</w:t>
+      </w:r>
+    </w:p>
+    <w:p>
+      <w:pPr>
+        <w:pStyle w:val="16"/>
         <w:numPr>
           <w:ilvl w:val="0"/>
           <w:numId w:val="1"/>
@@ -999,102 +1123,54 @@
           <w:sz w:val="20"/>
           <w:szCs w:val="20"/>
         </w:rPr>
-        <w:t xml:space="preserve">Built and shipped end-to-end prototypes at 6+ national hackathons under tight deadlines in cross-functional teams.</w:t>
+        <w:t xml:space="preserve">Built and shipped end-to-end prototypes at </w:t>
+      </w:r>
+      <w:r>
+        <w:rPr>
+          <w:rFonts w:hint="default"/>
+          <w:color w:val="222222"/>
+          <w:sz w:val="20"/>
+          <w:szCs w:val="20"/>
+          <w:lang w:val="en-US"/>
+        </w:rPr>
+        <w:t>13</w:t>
+      </w:r>
+      <w:r>
+        <w:rPr>
+          <w:color w:val="222222"/>
+          <w:sz w:val="20"/>
+          <w:szCs w:val="20"/>
+        </w:rPr>
+        <w:t xml:space="preserve"> national hackathons</w:t>
+      </w:r>
+      <w:bookmarkStart w:id="0" w:name="_GoBack"/>
+      <w:bookmarkEnd w:id="0"/>
+      <w:r>
+        <w:rPr>
+          <w:color w:val="222222"/>
+          <w:sz w:val="20"/>
+          <w:szCs w:val="20"/>
+        </w:rPr>
+        <w:t xml:space="preserve"> under tight deadlines in cross-functional teams.</w:t>
       </w:r>
     </w:p>
     <w:sectPr>
-      <w:pgSz w:w="12240" w:h="15840" w:orient="portrait"/>
+      <w:pgSz w:w="12240" w:h="15840"/>
       <w:pgMar w:top="480" w:right="560" w:bottom="480" w:left="560" w:header="708" w:footer="708" w:gutter="0"/>
-      <w:pgNumType/>
-      <w:docGrid w:linePitch="360"/>
+      <w:cols w:space="720" w:num="1"/>
+      <w:docGrid w:linePitch="360" w:charSpace="0"/>
     </w:sectPr>
   </w:body>
 </w:document>
 </file>
 
-<file path=word/comments.xml><?xml version="1.0" encoding="utf-8"?>
-<w:comments xmlns:cx="http://schemas.microsoft.com/office/drawing/2014/chartex" xmlns:cx1="http://schemas.microsoft.com/office/drawing/2015/9/8/chartex" xmlns:cx2="http://schemas.microsoft.com/office/drawing/2015/10/21/chartex" xmlns:cx3="http://schemas.microsoft.com/office/drawing/2016/5/9/chartex" xmlns:cx4="http://schemas.microsoft.com/office/drawing/2016/5/10/chartex" xmlns:cx5="http://schemas.microsoft.com/office/drawing/2016/5/11/chartex" xmlns:cx6="http://schemas.microsoft.com/office/drawing/2016/5/12/chartex" xmlns:cx7="http://schemas.microsoft.com/office/drawing/2016/5/13/chartex" xmlns:cx8="http://schemas.microsoft.com/office/drawing/2016/5/14/chartex" xmlns:mc="http://schemas.openxmlformats.org/markup-compatibility/2006" xmlns:aink="http://schemas.microsoft.com/office/drawing/2016/ink" xmlns:am3d="http://schemas.microsoft.com/office/drawing/2017/model3d" xmlns:o="urn:schemas-microsoft-com:office:office" xmlns:r="http://schemas.openxmlformats.org/officeDocument/2006/relationships" xmlns:m="http://schemas.openxmlformats.org/officeDocument/2006/math" xmlns:v="urn:schemas-microsoft-com:vml" xmlns:wp14="http://schemas.microsoft.com/office/word/2010/wordprocessingDrawing" xmlns:wp="http://schemas.openxmlformats.org/drawingml/2006/wordprocessingDrawing" xmlns:w10="urn:schemas-microsoft-com:office:word" xmlns:w="http://schemas.openxmlformats.org/wordprocessingml/2006/main" xmlns:w14="http://schemas.microsoft.com/office/word/2010/wordml" xmlns:w15="http://schemas.microsoft.com/office/word/2012/wordml" xmlns:w16cex="http://schemas.microsoft.com/office/word/2018/wordml/cex" xmlns:w16cid="http://schemas.microsoft.com/office/word/2016/wordml/cid" xmlns:w16="http://schemas.microsoft.com/office/word/2018/wordml" xmlns:w16sdtdh="http://schemas.microsoft.com/office/word/2020/wordml/sdtdatahash" xmlns:w16se="http://schemas.microsoft.com/office/word/2015/wordml/symex" xmlns:wpg="http://schemas.microsoft.com/office/word/2010/wordprocessingGroup" xmlns:wpi="http://schemas.microsoft.com/office/word/2010/wordprocessingInk" xmlns:wne="http://schemas.microsoft.com/office/word/2006/wordml" xmlns:wps="http://schemas.microsoft.com/office/word/2010/wordprocessingShape"/>
-</file>
-
-<file path=word/endnotes.xml><?xml version="1.0" encoding="utf-8"?>
-<w:endnotes xmlns:wpc="http://schemas.microsoft.com/office/word/2010/wordprocessingCanvas" xmlns:mc="http://schemas.openxmlformats.org/markup-compatibility/2006" xmlns:o="urn:schemas-microsoft-com:office:office" xmlns:r="http://schemas.openxmlformats.org/officeDocument/2006/relationships" xmlns:m="http://schemas.openxmlformats.org/officeDocument/2006/math" xmlns:v="urn:schemas-microsoft-com:vml" xmlns:wp14="http://schemas.microsoft.com/office/word/2010/wordprocessingDrawing" xmlns:wp="http://schemas.openxmlformats.org/drawingml/2006/wordprocessingDrawing" xmlns:w10="urn:schemas-microsoft-com:office:word" xmlns:w="http://schemas.openxmlformats.org/wordprocessingml/2006/main" xmlns:w14="http://schemas.microsoft.com/office/word/2010/wordml" xmlns:w15="http://schemas.microsoft.com/office/word/2012/wordml" xmlns:wpg="http://schemas.microsoft.com/office/word/2010/wordprocessingGroup" xmlns:wpi="http://schemas.microsoft.com/office/word/2010/wordprocessingInk" xmlns:wne="http://schemas.microsoft.com/office/word/2006/wordml" xmlns:wps="http://schemas.microsoft.com/office/word/2010/wordprocessingShape" mc:Ignorable="w14 w15 wp14">
-  <w:endnote w:type="separator" w:id="-1">
-    <w:p>
-      <w:pPr>
-        <w:spacing w:after="0" w:line="240" w:lineRule="auto"/>
-      </w:pPr>
-      <w:r>
-        <w:rPr>
-          <w:rStyle w:val="EndnoteReference"/>
-        </w:rPr>
-        <w:endnoteRef/>
-      </w:r>
-      <w:r>
-        <w:separator/>
-      </w:r>
-    </w:p>
-  </w:endnote>
-  <w:endnote w:type="continuationSeparator" w:id="0">
-    <w:p>
-      <w:pPr>
-        <w:spacing w:after="0" w:line="240" w:lineRule="auto"/>
-      </w:pPr>
-      <w:r>
-        <w:rPr>
-          <w:rStyle w:val="EndnoteReference"/>
-        </w:rPr>
-        <w:endnoteRef/>
-      </w:r>
-      <w:r>
-        <w:continuationSeparator/>
-      </w:r>
-    </w:p>
-  </w:endnote>
-</w:endnotes>
-</file>
-
-<file path=word/footnotes.xml><?xml version="1.0" encoding="utf-8"?>
-<w:footnotes xmlns:wpc="http://schemas.microsoft.com/office/word/2010/wordprocessingCanvas" xmlns:mc="http://schemas.openxmlformats.org/markup-compatibility/2006" xmlns:o="urn:schemas-microsoft-com:office:office" xmlns:r="http://schemas.openxmlformats.org/officeDocument/2006/relationships" xmlns:m="http://schemas.openxmlformats.org/officeDocument/2006/math" xmlns:v="urn:schemas-microsoft-com:vml" xmlns:wp14="http://schemas.microsoft.com/office/word/2010/wordprocessingDrawing" xmlns:wp="http://schemas.openxmlformats.org/drawingml/2006/wordprocessingDrawing" xmlns:w10="urn:schemas-microsoft-com:office:word" xmlns:w="http://schemas.openxmlformats.org/wordprocessingml/2006/main" xmlns:w14="http://schemas.microsoft.com/office/word/2010/wordml" xmlns:w15="http://schemas.microsoft.com/office/word/2012/wordml" xmlns:wpg="http://schemas.microsoft.com/office/word/2010/wordprocessingGroup" xmlns:wpi="http://schemas.microsoft.com/office/word/2010/wordprocessingInk" xmlns:wne="http://schemas.microsoft.com/office/word/2006/wordml" xmlns:wps="http://schemas.microsoft.com/office/word/2010/wordprocessingShape" mc:Ignorable="w14 w15 wp14">
-  <w:footnote w:type="separator" w:id="-1">
-    <w:p>
-      <w:pPr>
-        <w:spacing w:after="0" w:line="240" w:lineRule="auto"/>
-      </w:pPr>
-      <w:r>
-        <w:rPr>
-          <w:rStyle w:val="FootnoteReference"/>
-        </w:rPr>
-        <w:footnoteRef/>
-      </w:r>
-      <w:r>
-        <w:separator/>
-      </w:r>
-    </w:p>
-  </w:footnote>
-  <w:footnote w:type="continuationSeparator" w:id="0">
-    <w:p>
-      <w:pPr>
-        <w:spacing w:after="0" w:line="240" w:lineRule="auto"/>
-      </w:pPr>
-      <w:r>
-        <w:rPr>
-          <w:rStyle w:val="FootnoteReference"/>
-        </w:rPr>
-        <w:footnoteRef/>
-      </w:r>
-      <w:r>
-        <w:continuationSeparator/>
-      </w:r>
-    </w:p>
-  </w:footnote>
-</w:footnotes>
-</file>
-
 <file path=word/numbering.xml><?xml version="1.0" encoding="utf-8"?>
-<w:numbering xmlns:wpc="http://schemas.microsoft.com/office/word/2010/wordprocessingCanvas" xmlns:mc="http://schemas.openxmlformats.org/markup-compatibility/2006" xmlns:o="urn:schemas-microsoft-com:office:office" xmlns:r="http://schemas.openxmlformats.org/officeDocument/2006/relationships" xmlns:m="http://schemas.openxmlformats.org/officeDocument/2006/math" xmlns:v="urn:schemas-microsoft-com:vml" xmlns:wp14="http://schemas.microsoft.com/office/word/2010/wordprocessingDrawing" xmlns:wp="http://schemas.openxmlformats.org/drawingml/2006/wordprocessingDrawing" xmlns:w10="urn:schemas-microsoft-com:office:word" xmlns:w="http://schemas.openxmlformats.org/wordprocessingml/2006/main" xmlns:w14="http://schemas.microsoft.com/office/word/2010/wordml" xmlns:w15="http://schemas.microsoft.com/office/word/2012/wordml" xmlns:wpg="http://schemas.microsoft.com/office/word/2010/wordprocessingGroup" xmlns:wpi="http://schemas.microsoft.com/office/word/2010/wordprocessingInk" xmlns:wne="http://schemas.microsoft.com/office/word/2006/wordml" xmlns:wps="http://schemas.microsoft.com/office/word/2010/wordprocessingShape" mc:Ignorable="w14 w15 wp14">
-  <w:abstractNum w:abstractNumId="1" w15:restartNumberingAfterBreak="0">
-    <w:multiLevelType w:val="hybridMultilevel"/>
-    <w:lvl w:ilvl="0" w15:tentative="1">
+<w:numbering xmlns:wpc="http://schemas.microsoft.com/office/word/2010/wordprocessingCanvas" xmlns:mc="http://schemas.openxmlformats.org/markup-compatibility/2006" xmlns:o="urn:schemas-microsoft-com:office:office" xmlns:r="http://schemas.openxmlformats.org/officeDocument/2006/relationships" xmlns:m="http://schemas.openxmlformats.org/officeDocument/2006/math" xmlns:v="urn:schemas-microsoft-com:vml" xmlns:wp14="http://schemas.microsoft.com/office/word/2010/wordprocessingDrawing" xmlns:wp="http://schemas.openxmlformats.org/drawingml/2006/wordprocessingDrawing" xmlns:w10="urn:schemas-microsoft-com:office:word" xmlns:w="http://schemas.openxmlformats.org/wordprocessingml/2006/main" xmlns:w14="http://schemas.microsoft.com/office/word/2010/wordml" xmlns:wpg="http://schemas.microsoft.com/office/word/2010/wordprocessingGroup" xmlns:wpi="http://schemas.microsoft.com/office/word/2010/wordprocessingInk" xmlns:wne="http://schemas.microsoft.com/office/word/2006/wordml" xmlns:wps="http://schemas.microsoft.com/office/word/2010/wordprocessingShape" xmlns:wpsCustomData="http://www.wps.cn/officeDocument/2013/wpsCustomData" mc:Ignorable="w14 wp14">
+  <w:abstractNum w:abstractNumId="0">
+    <w:nsid w:val="0053208E"/>
+    <w:multiLevelType w:val="multilevel"/>
+    <w:tmpl w:val="0053208E"/>
+    <w:lvl w:ilvl="0" w:tentative="0">
       <w:start w:val="1"/>
       <w:numFmt w:val="bullet"/>
       <w:lvlText w:val="●"/>
@@ -1103,7 +1179,7 @@
         <w:ind w:left="720" w:hanging="360"/>
       </w:pPr>
     </w:lvl>
-    <w:lvl w:ilvl="1" w15:tentative="1">
+    <w:lvl w:ilvl="1" w:tentative="0">
       <w:start w:val="1"/>
       <w:numFmt w:val="bullet"/>
       <w:lvlText w:val="○"/>
@@ -1112,7 +1188,7 @@
         <w:ind w:left="1440" w:hanging="360"/>
       </w:pPr>
     </w:lvl>
-    <w:lvl w:ilvl="2" w15:tentative="1">
+    <w:lvl w:ilvl="2" w:tentative="0">
       <w:start w:val="1"/>
       <w:numFmt w:val="bullet"/>
       <w:lvlText w:val="■"/>
@@ -1121,7 +1197,7 @@
         <w:ind w:left="2160" w:hanging="360"/>
       </w:pPr>
     </w:lvl>
-    <w:lvl w:ilvl="3" w15:tentative="1">
+    <w:lvl w:ilvl="3" w:tentative="0">
       <w:start w:val="1"/>
       <w:numFmt w:val="bullet"/>
       <w:lvlText w:val="●"/>
@@ -1130,7 +1206,7 @@
         <w:ind w:left="2880" w:hanging="360"/>
       </w:pPr>
     </w:lvl>
-    <w:lvl w:ilvl="4" w15:tentative="1">
+    <w:lvl w:ilvl="4" w:tentative="0">
       <w:start w:val="1"/>
       <w:numFmt w:val="bullet"/>
       <w:lvlText w:val="○"/>
@@ -1139,7 +1215,7 @@
         <w:ind w:left="3600" w:hanging="360"/>
       </w:pPr>
     </w:lvl>
-    <w:lvl w:ilvl="5" w15:tentative="1">
+    <w:lvl w:ilvl="5" w:tentative="0">
       <w:start w:val="1"/>
       <w:numFmt w:val="bullet"/>
       <w:lvlText w:val="■"/>
@@ -1148,7 +1224,7 @@
         <w:ind w:left="4320" w:hanging="360"/>
       </w:pPr>
     </w:lvl>
-    <w:lvl w:ilvl="6" w15:tentative="1">
+    <w:lvl w:ilvl="6" w:tentative="0">
       <w:start w:val="1"/>
       <w:numFmt w:val="bullet"/>
       <w:lvlText w:val="●"/>
@@ -1157,7 +1233,7 @@
         <w:ind w:left="5040" w:hanging="360"/>
       </w:pPr>
     </w:lvl>
-    <w:lvl w:ilvl="7" w15:tentative="1">
+    <w:lvl w:ilvl="7" w:tentative="0">
       <w:start w:val="1"/>
       <w:numFmt w:val="bullet"/>
       <w:lvlText w:val="●"/>
@@ -1166,7 +1242,7 @@
         <w:ind w:left="5760" w:hanging="360"/>
       </w:pPr>
     </w:lvl>
-    <w:lvl w:ilvl="8" w15:tentative="1">
+    <w:lvl w:ilvl="8" w:tentative="0">
       <w:start w:val="1"/>
       <w:numFmt w:val="bullet"/>
       <w:lvlText w:val="●"/>
@@ -1177,7 +1253,7 @@
     </w:lvl>
   </w:abstractNum>
   <w:num w:numId="1">
-    <w:abstractNumId w:val="1"/>
+    <w:abstractNumId w:val="0"/>
     <w:lvlOverride w:ilvl="0">
       <w:startOverride w:val="1"/>
     </w:lvlOverride>
@@ -1186,125 +1262,379 @@
 </file>
 
 <file path=word/styles.xml><?xml version="1.0" encoding="utf-8"?>
-<w:styles xmlns:mc="http://schemas.openxmlformats.org/markup-compatibility/2006" xmlns:r="http://schemas.openxmlformats.org/officeDocument/2006/relationships" xmlns:w="http://schemas.openxmlformats.org/wordprocessingml/2006/main" xmlns:w14="http://schemas.microsoft.com/office/word/2010/wordml" xmlns:w15="http://schemas.microsoft.com/office/word/2012/wordml" mc:Ignorable="w14 w15">
+<w:styles xmlns:mc="http://schemas.openxmlformats.org/markup-compatibility/2006" xmlns:o="urn:schemas-microsoft-com:office:office" xmlns:r="http://schemas.openxmlformats.org/officeDocument/2006/relationships" xmlns:m="http://schemas.openxmlformats.org/officeDocument/2006/math" xmlns:v="urn:schemas-microsoft-com:vml" xmlns:w="http://schemas.openxmlformats.org/wordprocessingml/2006/main" xmlns:w14="http://schemas.microsoft.com/office/word/2010/wordml" xmlns:w10="urn:schemas-microsoft-com:office:word" xmlns:sl="http://schemas.openxmlformats.org/schemaLibrary/2006/main" xmlns:wpsCustomData="http://www.wps.cn/officeDocument/2013/wpsCustomData" mc:Ignorable="w14">
   <w:docDefaults>
-    <w:rPrDefault/>
+    <w:rPrDefault>
+      <w:rPr>
+        <w:rFonts w:asciiTheme="minorHAnsi" w:hAnsiTheme="minorHAnsi" w:eastAsiaTheme="minorEastAsia" w:cstheme="minorBidi"/>
+      </w:rPr>
+    </w:rPrDefault>
     <w:pPrDefault/>
   </w:docDefaults>
-  <w:style w:type="paragraph" w:styleId="Title">
-    <w:name w:val="Title"/>
-    <w:basedOn w:val="Normal"/>
-    <w:next w:val="Normal"/>
+  <w:latentStyles w:count="260" w:defQFormat="0" w:defUnhideWhenUsed="1" w:defSemiHidden="1" w:defUIPriority="99" w:defLockedState="0">
+    <w:lsdException w:qFormat="1" w:unhideWhenUsed="0" w:uiPriority="0" w:semiHidden="0" w:name="Normal"/>
+    <w:lsdException w:qFormat="1" w:unhideWhenUsed="0" w:uiPriority="0" w:semiHidden="0" w:name="heading 1"/>
+    <w:lsdException w:qFormat="1" w:unhideWhenUsed="0" w:uiPriority="0" w:semiHidden="0" w:name="heading 2"/>
+    <w:lsdException w:qFormat="1" w:unhideWhenUsed="0" w:uiPriority="0" w:semiHidden="0" w:name="heading 3"/>
+    <w:lsdException w:qFormat="1" w:unhideWhenUsed="0" w:uiPriority="0" w:semiHidden="0" w:name="heading 4"/>
+    <w:lsdException w:qFormat="1" w:unhideWhenUsed="0" w:uiPriority="0" w:semiHidden="0" w:name="heading 5"/>
+    <w:lsdException w:qFormat="1" w:unhideWhenUsed="0" w:uiPriority="0" w:semiHidden="0" w:name="heading 6"/>
+    <w:lsdException w:qFormat="1" w:uiPriority="0" w:name="heading 7"/>
+    <w:lsdException w:qFormat="1" w:uiPriority="0" w:name="heading 8"/>
+    <w:lsdException w:qFormat="1" w:uiPriority="0" w:name="heading 9"/>
+    <w:lsdException w:unhideWhenUsed="0" w:uiPriority="0" w:semiHidden="0" w:name="index 1"/>
+    <w:lsdException w:unhideWhenUsed="0" w:uiPriority="0" w:semiHidden="0" w:name="index 2"/>
+    <w:lsdException w:unhideWhenUsed="0" w:uiPriority="0" w:semiHidden="0" w:name="index 3"/>
+    <w:lsdException w:unhideWhenUsed="0" w:uiPriority="0" w:semiHidden="0" w:name="index 4"/>
+    <w:lsdException w:unhideWhenUsed="0" w:uiPriority="0" w:semiHidden="0" w:name="index 5"/>
+    <w:lsdException w:unhideWhenUsed="0" w:uiPriority="0" w:semiHidden="0" w:name="index 6"/>
+    <w:lsdException w:unhideWhenUsed="0" w:uiPriority="0" w:semiHidden="0" w:name="index 7"/>
+    <w:lsdException w:unhideWhenUsed="0" w:uiPriority="0" w:semiHidden="0" w:name="index 8"/>
+    <w:lsdException w:unhideWhenUsed="0" w:uiPriority="0" w:semiHidden="0" w:name="index 9"/>
+    <w:lsdException w:unhideWhenUsed="0" w:uiPriority="0" w:semiHidden="0" w:name="toc 1"/>
+    <w:lsdException w:unhideWhenUsed="0" w:uiPriority="0" w:semiHidden="0" w:name="toc 2"/>
+    <w:lsdException w:unhideWhenUsed="0" w:uiPriority="0" w:semiHidden="0" w:name="toc 3"/>
+    <w:lsdException w:unhideWhenUsed="0" w:uiPriority="0" w:semiHidden="0" w:name="toc 4"/>
+    <w:lsdException w:unhideWhenUsed="0" w:uiPriority="0" w:semiHidden="0" w:name="toc 5"/>
+    <w:lsdException w:unhideWhenUsed="0" w:uiPriority="0" w:semiHidden="0" w:name="toc 6"/>
+    <w:lsdException w:unhideWhenUsed="0" w:uiPriority="0" w:semiHidden="0" w:name="toc 7"/>
+    <w:lsdException w:unhideWhenUsed="0" w:uiPriority="0" w:semiHidden="0" w:name="toc 8"/>
+    <w:lsdException w:unhideWhenUsed="0" w:uiPriority="0" w:semiHidden="0" w:name="toc 9"/>
+    <w:lsdException w:unhideWhenUsed="0" w:uiPriority="0" w:semiHidden="0" w:name="Normal Indent"/>
+    <w:lsdException w:qFormat="1" w:uiPriority="99" w:name="footnote text"/>
+    <w:lsdException w:unhideWhenUsed="0" w:uiPriority="0" w:semiHidden="0" w:name="annotation text"/>
+    <w:lsdException w:unhideWhenUsed="0" w:uiPriority="0" w:semiHidden="0" w:name="header"/>
+    <w:lsdException w:unhideWhenUsed="0" w:uiPriority="0" w:semiHidden="0" w:name="footer"/>
+    <w:lsdException w:unhideWhenUsed="0" w:uiPriority="0" w:semiHidden="0" w:name="index heading"/>
+    <w:lsdException w:qFormat="1" w:uiPriority="0" w:name="caption"/>
+    <w:lsdException w:unhideWhenUsed="0" w:uiPriority="0" w:semiHidden="0" w:name="table of figures"/>
+    <w:lsdException w:unhideWhenUsed="0" w:uiPriority="0" w:semiHidden="0" w:name="envelope address"/>
+    <w:lsdException w:unhideWhenUsed="0" w:uiPriority="0" w:semiHidden="0" w:name="envelope return"/>
+    <w:lsdException w:qFormat="1" w:uiPriority="99" w:name="footnote reference"/>
+    <w:lsdException w:unhideWhenUsed="0" w:uiPriority="0" w:semiHidden="0" w:name="annotation reference"/>
+    <w:lsdException w:unhideWhenUsed="0" w:uiPriority="0" w:semiHidden="0" w:name="line number"/>
+    <w:lsdException w:unhideWhenUsed="0" w:uiPriority="0" w:semiHidden="0" w:name="page number"/>
+    <w:lsdException w:qFormat="1" w:uiPriority="99" w:name="endnote reference"/>
+    <w:lsdException w:qFormat="1" w:uiPriority="99" w:name="endnote text"/>
+    <w:lsdException w:unhideWhenUsed="0" w:uiPriority="0" w:semiHidden="0" w:name="table of authorities"/>
+    <w:lsdException w:unhideWhenUsed="0" w:uiPriority="0" w:semiHidden="0" w:name="macro"/>
+    <w:lsdException w:unhideWhenUsed="0" w:uiPriority="0" w:semiHidden="0" w:name="toa heading"/>
+    <w:lsdException w:unhideWhenUsed="0" w:uiPriority="0" w:semiHidden="0" w:name="List"/>
+    <w:lsdException w:unhideWhenUsed="0" w:uiPriority="0" w:semiHidden="0" w:name="List Bullet"/>
+    <w:lsdException w:unhideWhenUsed="0" w:uiPriority="0" w:semiHidden="0" w:name="List Number"/>
+    <w:lsdException w:unhideWhenUsed="0" w:uiPriority="0" w:semiHidden="0" w:name="List 2"/>
+    <w:lsdException w:unhideWhenUsed="0" w:uiPriority="0" w:semiHidden="0" w:name="List 3"/>
+    <w:lsdException w:unhideWhenUsed="0" w:uiPriority="0" w:semiHidden="0" w:name="List 4"/>
+    <w:lsdException w:unhideWhenUsed="0" w:uiPriority="0" w:semiHidden="0" w:name="List 5"/>
+    <w:lsdException w:unhideWhenUsed="0" w:uiPriority="0" w:semiHidden="0" w:name="List Bullet 2"/>
+    <w:lsdException w:unhideWhenUsed="0" w:uiPriority="0" w:semiHidden="0" w:name="List Bullet 3"/>
+    <w:lsdException w:unhideWhenUsed="0" w:uiPriority="0" w:semiHidden="0" w:name="List Bullet 4"/>
+    <w:lsdException w:unhideWhenUsed="0" w:uiPriority="0" w:semiHidden="0" w:name="List Bullet 5"/>
+    <w:lsdException w:unhideWhenUsed="0" w:uiPriority="0" w:semiHidden="0" w:name="List Number 2"/>
+    <w:lsdException w:unhideWhenUsed="0" w:uiPriority="0" w:semiHidden="0" w:name="List Number 3"/>
+    <w:lsdException w:unhideWhenUsed="0" w:uiPriority="0" w:semiHidden="0" w:name="List Number 4"/>
+    <w:lsdException w:unhideWhenUsed="0" w:uiPriority="0" w:semiHidden="0" w:name="List Number 5"/>
+    <w:lsdException w:qFormat="1" w:unhideWhenUsed="0" w:uiPriority="0" w:semiHidden="0" w:name="Title"/>
+    <w:lsdException w:unhideWhenUsed="0" w:uiPriority="0" w:semiHidden="0" w:name="Closing"/>
+    <w:lsdException w:unhideWhenUsed="0" w:uiPriority="0" w:semiHidden="0" w:name="Signature"/>
+    <w:lsdException w:qFormat="1" w:unhideWhenUsed="0" w:uiPriority="0" w:name="Default Paragraph Font"/>
+    <w:lsdException w:unhideWhenUsed="0" w:uiPriority="0" w:semiHidden="0" w:name="Body Text"/>
+    <w:lsdException w:unhideWhenUsed="0" w:uiPriority="0" w:semiHidden="0" w:name="Body Text Indent"/>
+    <w:lsdException w:unhideWhenUsed="0" w:uiPriority="0" w:semiHidden="0" w:name="List Continue"/>
+    <w:lsdException w:unhideWhenUsed="0" w:uiPriority="0" w:semiHidden="0" w:name="List Continue 2"/>
+    <w:lsdException w:unhideWhenUsed="0" w:uiPriority="0" w:semiHidden="0" w:name="List Continue 3"/>
+    <w:lsdException w:unhideWhenUsed="0" w:uiPriority="0" w:semiHidden="0" w:name="List Continue 4"/>
+    <w:lsdException w:unhideWhenUsed="0" w:uiPriority="0" w:semiHidden="0" w:name="List Continue 5"/>
+    <w:lsdException w:unhideWhenUsed="0" w:uiPriority="0" w:semiHidden="0" w:name="Message Header"/>
+    <w:lsdException w:qFormat="1" w:unhideWhenUsed="0" w:uiPriority="0" w:semiHidden="0" w:name="Subtitle"/>
+    <w:lsdException w:unhideWhenUsed="0" w:uiPriority="0" w:semiHidden="0" w:name="Salutation"/>
+    <w:lsdException w:unhideWhenUsed="0" w:uiPriority="0" w:semiHidden="0" w:name="Date"/>
+    <w:lsdException w:unhideWhenUsed="0" w:uiPriority="0" w:semiHidden="0" w:name="Body Text First Indent"/>
+    <w:lsdException w:unhideWhenUsed="0" w:uiPriority="0" w:semiHidden="0" w:name="Body Text First Indent 2"/>
+    <w:lsdException w:unhideWhenUsed="0" w:uiPriority="0" w:semiHidden="0" w:name="Note Heading"/>
+    <w:lsdException w:unhideWhenUsed="0" w:uiPriority="0" w:semiHidden="0" w:name="Body Text 2"/>
+    <w:lsdException w:unhideWhenUsed="0" w:uiPriority="0" w:semiHidden="0" w:name="Body Text 3"/>
+    <w:lsdException w:unhideWhenUsed="0" w:uiPriority="0" w:semiHidden="0" w:name="Body Text Indent 2"/>
+    <w:lsdException w:unhideWhenUsed="0" w:uiPriority="0" w:semiHidden="0" w:name="Body Text Indent 3"/>
+    <w:lsdException w:unhideWhenUsed="0" w:uiPriority="0" w:semiHidden="0" w:name="Block Text"/>
+    <w:lsdException w:qFormat="1" w:uiPriority="99" w:semiHidden="0" w:name="Hyperlink"/>
+    <w:lsdException w:unhideWhenUsed="0" w:uiPriority="0" w:semiHidden="0" w:name="FollowedHyperlink"/>
+    <w:lsdException w:qFormat="1" w:unhideWhenUsed="0" w:uiPriority="0" w:semiHidden="0" w:name="Strong"/>
+    <w:lsdException w:qFormat="1" w:unhideWhenUsed="0" w:uiPriority="0" w:semiHidden="0" w:name="Emphasis"/>
+    <w:lsdException w:unhideWhenUsed="0" w:uiPriority="0" w:semiHidden="0" w:name="Document Map"/>
+    <w:lsdException w:unhideWhenUsed="0" w:uiPriority="0" w:semiHidden="0" w:name="Plain Text"/>
+    <w:lsdException w:unhideWhenUsed="0" w:uiPriority="0" w:semiHidden="0" w:name="E-mail Signature"/>
+    <w:lsdException w:unhideWhenUsed="0" w:uiPriority="0" w:semiHidden="0" w:name="Normal (Web)"/>
+    <w:lsdException w:unhideWhenUsed="0" w:uiPriority="0" w:semiHidden="0" w:name="HTML Acronym"/>
+    <w:lsdException w:unhideWhenUsed="0" w:uiPriority="0" w:semiHidden="0" w:name="HTML Address"/>
+    <w:lsdException w:unhideWhenUsed="0" w:uiPriority="0" w:semiHidden="0" w:name="HTML Cite"/>
+    <w:lsdException w:unhideWhenUsed="0" w:uiPriority="0" w:semiHidden="0" w:name="HTML Code"/>
+    <w:lsdException w:unhideWhenUsed="0" w:uiPriority="0" w:semiHidden="0" w:name="HTML Definition"/>
+    <w:lsdException w:unhideWhenUsed="0" w:uiPriority="0" w:semiHidden="0" w:name="HTML Keyboard"/>
+    <w:lsdException w:unhideWhenUsed="0" w:uiPriority="0" w:semiHidden="0" w:name="HTML Preformatted"/>
+    <w:lsdException w:unhideWhenUsed="0" w:uiPriority="0" w:semiHidden="0" w:name="HTML Sample"/>
+    <w:lsdException w:unhideWhenUsed="0" w:uiPriority="0" w:semiHidden="0" w:name="HTML Typewriter"/>
+    <w:lsdException w:unhideWhenUsed="0" w:uiPriority="0" w:semiHidden="0" w:name="HTML Variable"/>
+    <w:lsdException w:unhideWhenUsed="0" w:uiPriority="0" w:name="Normal Table"/>
+    <w:lsdException w:unhideWhenUsed="0" w:uiPriority="0" w:semiHidden="0" w:name="annotation subject"/>
+    <w:lsdException w:unhideWhenUsed="0" w:uiPriority="0" w:semiHidden="0" w:name="Table Simple 1"/>
+    <w:lsdException w:unhideWhenUsed="0" w:uiPriority="0" w:semiHidden="0" w:name="Table Simple 2"/>
+    <w:lsdException w:unhideWhenUsed="0" w:uiPriority="0" w:semiHidden="0" w:name="Table Simple 3"/>
+    <w:lsdException w:unhideWhenUsed="0" w:uiPriority="0" w:semiHidden="0" w:name="Table Classic 1"/>
+    <w:lsdException w:unhideWhenUsed="0" w:uiPriority="0" w:semiHidden="0" w:name="Table Classic 2"/>
+    <w:lsdException w:unhideWhenUsed="0" w:uiPriority="0" w:semiHidden="0" w:name="Table Classic 3"/>
+    <w:lsdException w:unhideWhenUsed="0" w:uiPriority="0" w:semiHidden="0" w:name="Table Classic 4"/>
+    <w:lsdException w:unhideWhenUsed="0" w:uiPriority="0" w:semiHidden="0" w:name="Table Colorful 1"/>
+    <w:lsdException w:unhideWhenUsed="0" w:uiPriority="0" w:semiHidden="0" w:name="Table Colorful 2"/>
+    <w:lsdException w:unhideWhenUsed="0" w:uiPriority="0" w:semiHidden="0" w:name="Table Colorful 3"/>
+    <w:lsdException w:unhideWhenUsed="0" w:uiPriority="0" w:semiHidden="0" w:name="Table Columns 1"/>
+    <w:lsdException w:unhideWhenUsed="0" w:uiPriority="0" w:semiHidden="0" w:name="Table Columns 2"/>
+    <w:lsdException w:unhideWhenUsed="0" w:uiPriority="0" w:semiHidden="0" w:name="Table Columns 3"/>
+    <w:lsdException w:unhideWhenUsed="0" w:uiPriority="0" w:semiHidden="0" w:name="Table Columns 4"/>
+    <w:lsdException w:unhideWhenUsed="0" w:uiPriority="0" w:semiHidden="0" w:name="Table Columns 5"/>
+    <w:lsdException w:unhideWhenUsed="0" w:uiPriority="0" w:semiHidden="0" w:name="Table Grid 1"/>
+    <w:lsdException w:unhideWhenUsed="0" w:uiPriority="0" w:semiHidden="0" w:name="Table Grid 2"/>
+    <w:lsdException w:unhideWhenUsed="0" w:uiPriority="0" w:semiHidden="0" w:name="Table Grid 3"/>
+    <w:lsdException w:unhideWhenUsed="0" w:uiPriority="0" w:semiHidden="0" w:name="Table Grid 4"/>
+    <w:lsdException w:unhideWhenUsed="0" w:uiPriority="0" w:semiHidden="0" w:name="Table Grid 5"/>
+    <w:lsdException w:unhideWhenUsed="0" w:uiPriority="0" w:semiHidden="0" w:name="Table Grid 6"/>
+    <w:lsdException w:unhideWhenUsed="0" w:uiPriority="0" w:semiHidden="0" w:name="Table Grid 7"/>
+    <w:lsdException w:unhideWhenUsed="0" w:uiPriority="0" w:semiHidden="0" w:name="Table Grid 8"/>
+    <w:lsdException w:unhideWhenUsed="0" w:uiPriority="0" w:semiHidden="0" w:name="Table List 1"/>
+    <w:lsdException w:unhideWhenUsed="0" w:uiPriority="0" w:semiHidden="0" w:name="Table List 2"/>
+    <w:lsdException w:unhideWhenUsed="0" w:uiPriority="0" w:semiHidden="0" w:name="Table List 3"/>
+    <w:lsdException w:unhideWhenUsed="0" w:uiPriority="0" w:semiHidden="0" w:name="Table List 4"/>
+    <w:lsdException w:unhideWhenUsed="0" w:uiPriority="0" w:semiHidden="0" w:name="Table List 5"/>
+    <w:lsdException w:unhideWhenUsed="0" w:uiPriority="0" w:semiHidden="0" w:name="Table List 6"/>
+    <w:lsdException w:unhideWhenUsed="0" w:uiPriority="0" w:semiHidden="0" w:name="Table List 7"/>
+    <w:lsdException w:unhideWhenUsed="0" w:uiPriority="0" w:semiHidden="0" w:name="Table List 8"/>
+    <w:lsdException w:unhideWhenUsed="0" w:uiPriority="0" w:semiHidden="0" w:name="Table 3D effects 1"/>
+    <w:lsdException w:unhideWhenUsed="0" w:uiPriority="0" w:semiHidden="0" w:name="Table 3D effects 2"/>
+    <w:lsdException w:unhideWhenUsed="0" w:uiPriority="0" w:semiHidden="0" w:name="Table 3D effects 3"/>
+    <w:lsdException w:unhideWhenUsed="0" w:uiPriority="0" w:semiHidden="0" w:name="Table Contemporary"/>
+    <w:lsdException w:unhideWhenUsed="0" w:uiPriority="0" w:semiHidden="0" w:name="Table Elegant"/>
+    <w:lsdException w:unhideWhenUsed="0" w:uiPriority="0" w:semiHidden="0" w:name="Table Professional"/>
+    <w:lsdException w:unhideWhenUsed="0" w:uiPriority="0" w:semiHidden="0" w:name="Table Subtle 1"/>
+    <w:lsdException w:unhideWhenUsed="0" w:uiPriority="0" w:semiHidden="0" w:name="Table Subtle 2"/>
+    <w:lsdException w:unhideWhenUsed="0" w:uiPriority="0" w:semiHidden="0" w:name="Table Web 1"/>
+    <w:lsdException w:unhideWhenUsed="0" w:uiPriority="0" w:semiHidden="0" w:name="Table Web 2"/>
+    <w:lsdException w:unhideWhenUsed="0" w:uiPriority="0" w:semiHidden="0" w:name="Table Web 3"/>
+    <w:lsdException w:unhideWhenUsed="0" w:uiPriority="0" w:semiHidden="0" w:name="Balloon Text"/>
+    <w:lsdException w:unhideWhenUsed="0" w:uiPriority="0" w:semiHidden="0" w:name="Table Grid"/>
+    <w:lsdException w:unhideWhenUsed="0" w:uiPriority="0" w:semiHidden="0" w:name="Table Theme"/>
+    <w:lsdException w:unhideWhenUsed="0" w:uiPriority="60" w:semiHidden="0" w:name="Light Shading"/>
+    <w:lsdException w:unhideWhenUsed="0" w:uiPriority="61" w:semiHidden="0" w:name="Light List"/>
+    <w:lsdException w:unhideWhenUsed="0" w:uiPriority="62" w:semiHidden="0" w:name="Light Grid"/>
+    <w:lsdException w:unhideWhenUsed="0" w:uiPriority="63" w:semiHidden="0" w:name="Medium Shading 1"/>
+    <w:lsdException w:unhideWhenUsed="0" w:uiPriority="64" w:semiHidden="0" w:name="Medium Shading 2"/>
+    <w:lsdException w:unhideWhenUsed="0" w:uiPriority="65" w:semiHidden="0" w:name="Medium List 1"/>
+    <w:lsdException w:unhideWhenUsed="0" w:uiPriority="66" w:semiHidden="0" w:name="Medium List 2"/>
+    <w:lsdException w:unhideWhenUsed="0" w:uiPriority="67" w:semiHidden="0" w:name="Medium Grid 1"/>
+    <w:lsdException w:unhideWhenUsed="0" w:uiPriority="68" w:semiHidden="0" w:name="Medium Grid 2"/>
+    <w:lsdException w:unhideWhenUsed="0" w:uiPriority="69" w:semiHidden="0" w:name="Medium Grid 3"/>
+    <w:lsdException w:unhideWhenUsed="0" w:uiPriority="70" w:semiHidden="0" w:name="Dark List"/>
+    <w:lsdException w:unhideWhenUsed="0" w:uiPriority="71" w:semiHidden="0" w:name="Colorful Shading"/>
+    <w:lsdException w:unhideWhenUsed="0" w:uiPriority="72" w:semiHidden="0" w:name="Colorful List"/>
+    <w:lsdException w:unhideWhenUsed="0" w:uiPriority="73" w:semiHidden="0" w:name="Colorful Grid"/>
+    <w:lsdException w:unhideWhenUsed="0" w:uiPriority="60" w:semiHidden="0" w:name="Light Shading Accent 1"/>
+    <w:lsdException w:unhideWhenUsed="0" w:uiPriority="61" w:semiHidden="0" w:name="Light List Accent 1"/>
+    <w:lsdException w:unhideWhenUsed="0" w:uiPriority="62" w:semiHidden="0" w:name="Light Grid Accent 1"/>
+    <w:lsdException w:unhideWhenUsed="0" w:uiPriority="63" w:semiHidden="0" w:name="Medium Shading 1 Accent 1"/>
+    <w:lsdException w:unhideWhenUsed="0" w:uiPriority="64" w:semiHidden="0" w:name="Medium Shading 2 Accent 1"/>
+    <w:lsdException w:unhideWhenUsed="0" w:uiPriority="65" w:semiHidden="0" w:name="Medium List 1 Accent 1"/>
+    <w:lsdException w:qFormat="1" w:unhideWhenUsed="0" w:uiPriority="0" w:semiHidden="0" w:name="List Paragraph"/>
+    <w:lsdException w:unhideWhenUsed="0" w:uiPriority="66" w:semiHidden="0" w:name="Medium List 2 Accent 1"/>
+    <w:lsdException w:unhideWhenUsed="0" w:uiPriority="67" w:semiHidden="0" w:name="Medium Grid 1 Accent 1"/>
+    <w:lsdException w:unhideWhenUsed="0" w:uiPriority="68" w:semiHidden="0" w:name="Medium Grid 2 Accent 1"/>
+    <w:lsdException w:unhideWhenUsed="0" w:uiPriority="69" w:semiHidden="0" w:name="Medium Grid 3 Accent 1"/>
+    <w:lsdException w:unhideWhenUsed="0" w:uiPriority="70" w:semiHidden="0" w:name="Dark List Accent 1"/>
+    <w:lsdException w:unhideWhenUsed="0" w:uiPriority="71" w:semiHidden="0" w:name="Colorful Shading Accent 1"/>
+    <w:lsdException w:unhideWhenUsed="0" w:uiPriority="72" w:semiHidden="0" w:name="Colorful List Accent 1"/>
+    <w:lsdException w:unhideWhenUsed="0" w:uiPriority="73" w:semiHidden="0" w:name="Colorful Grid Accent 1"/>
+    <w:lsdException w:unhideWhenUsed="0" w:uiPriority="60" w:semiHidden="0" w:name="Light Shading Accent 2"/>
+    <w:lsdException w:unhideWhenUsed="0" w:uiPriority="61" w:semiHidden="0" w:name="Light List Accent 2"/>
+    <w:lsdException w:unhideWhenUsed="0" w:uiPriority="62" w:semiHidden="0" w:name="Light Grid Accent 2"/>
+    <w:lsdException w:unhideWhenUsed="0" w:uiPriority="63" w:semiHidden="0" w:name="Medium Shading 1 Accent 2"/>
+    <w:lsdException w:unhideWhenUsed="0" w:uiPriority="64" w:semiHidden="0" w:name="Medium Shading 2 Accent 2"/>
+    <w:lsdException w:unhideWhenUsed="0" w:uiPriority="65" w:semiHidden="0" w:name="Medium List 1 Accent 2"/>
+    <w:lsdException w:unhideWhenUsed="0" w:uiPriority="66" w:semiHidden="0" w:name="Medium List 2 Accent 2"/>
+    <w:lsdException w:unhideWhenUsed="0" w:uiPriority="67" w:semiHidden="0" w:name="Medium Grid 1 Accent 2"/>
+    <w:lsdException w:unhideWhenUsed="0" w:uiPriority="68" w:semiHidden="0" w:name="Medium Grid 2 Accent 2"/>
+    <w:lsdException w:unhideWhenUsed="0" w:uiPriority="69" w:semiHidden="0" w:name="Medium Grid 3 Accent 2"/>
+    <w:lsdException w:unhideWhenUsed="0" w:uiPriority="70" w:semiHidden="0" w:name="Dark List Accent 2"/>
+    <w:lsdException w:unhideWhenUsed="0" w:uiPriority="71" w:semiHidden="0" w:name="Colorful Shading Accent 2"/>
+    <w:lsdException w:unhideWhenUsed="0" w:uiPriority="72" w:semiHidden="0" w:name="Colorful List Accent 2"/>
+    <w:lsdException w:unhideWhenUsed="0" w:uiPriority="73" w:semiHidden="0" w:name="Colorful Grid Accent 2"/>
+    <w:lsdException w:unhideWhenUsed="0" w:uiPriority="60" w:semiHidden="0" w:name="Light Shading Accent 3"/>
+    <w:lsdException w:unhideWhenUsed="0" w:uiPriority="61" w:semiHidden="0" w:name="Light List Accent 3"/>
+    <w:lsdException w:unhideWhenUsed="0" w:uiPriority="62" w:semiHidden="0" w:name="Light Grid Accent 3"/>
+    <w:lsdException w:unhideWhenUsed="0" w:uiPriority="63" w:semiHidden="0" w:name="Medium Shading 1 Accent 3"/>
+    <w:lsdException w:unhideWhenUsed="0" w:uiPriority="64" w:semiHidden="0" w:name="Medium Shading 2 Accent 3"/>
+    <w:lsdException w:unhideWhenUsed="0" w:uiPriority="65" w:semiHidden="0" w:name="Medium List 1 Accent 3"/>
+    <w:lsdException w:unhideWhenUsed="0" w:uiPriority="66" w:semiHidden="0" w:name="Medium List 2 Accent 3"/>
+    <w:lsdException w:unhideWhenUsed="0" w:uiPriority="67" w:semiHidden="0" w:name="Medium Grid 1 Accent 3"/>
+    <w:lsdException w:unhideWhenUsed="0" w:uiPriority="68" w:semiHidden="0" w:name="Medium Grid 2 Accent 3"/>
+    <w:lsdException w:unhideWhenUsed="0" w:uiPriority="69" w:semiHidden="0" w:name="Medium Grid 3 Accent 3"/>
+    <w:lsdException w:unhideWhenUsed="0" w:uiPriority="70" w:semiHidden="0" w:name="Dark List Accent 3"/>
+    <w:lsdException w:unhideWhenUsed="0" w:uiPriority="71" w:semiHidden="0" w:name="Colorful Shading Accent 3"/>
+    <w:lsdException w:unhideWhenUsed="0" w:uiPriority="72" w:semiHidden="0" w:name="Colorful List Accent 3"/>
+    <w:lsdException w:unhideWhenUsed="0" w:uiPriority="73" w:semiHidden="0" w:name="Colorful Grid Accent 3"/>
+    <w:lsdException w:unhideWhenUsed="0" w:uiPriority="60" w:semiHidden="0" w:name="Light Shading Accent 4"/>
+    <w:lsdException w:unhideWhenUsed="0" w:uiPriority="61" w:semiHidden="0" w:name="Light List Accent 4"/>
+    <w:lsdException w:unhideWhenUsed="0" w:uiPriority="62" w:semiHidden="0" w:name="Light Grid Accent 4"/>
+    <w:lsdException w:unhideWhenUsed="0" w:uiPriority="63" w:semiHidden="0" w:name="Medium Shading 1 Accent 4"/>
+    <w:lsdException w:unhideWhenUsed="0" w:uiPriority="64" w:semiHidden="0" w:name="Medium Shading 2 Accent 4"/>
+    <w:lsdException w:unhideWhenUsed="0" w:uiPriority="65" w:semiHidden="0" w:name="Medium List 1 Accent 4"/>
+    <w:lsdException w:unhideWhenUsed="0" w:uiPriority="66" w:semiHidden="0" w:name="Medium List 2 Accent 4"/>
+    <w:lsdException w:unhideWhenUsed="0" w:uiPriority="67" w:semiHidden="0" w:name="Medium Grid 1 Accent 4"/>
+    <w:lsdException w:unhideWhenUsed="0" w:uiPriority="68" w:semiHidden="0" w:name="Medium Grid 2 Accent 4"/>
+    <w:lsdException w:unhideWhenUsed="0" w:uiPriority="69" w:semiHidden="0" w:name="Medium Grid 3 Accent 4"/>
+    <w:lsdException w:unhideWhenUsed="0" w:uiPriority="70" w:semiHidden="0" w:name="Dark List Accent 4"/>
+    <w:lsdException w:unhideWhenUsed="0" w:uiPriority="71" w:semiHidden="0" w:name="Colorful Shading Accent 4"/>
+    <w:lsdException w:unhideWhenUsed="0" w:uiPriority="72" w:semiHidden="0" w:name="Colorful List Accent 4"/>
+    <w:lsdException w:unhideWhenUsed="0" w:uiPriority="73" w:semiHidden="0" w:name="Colorful Grid Accent 4"/>
+    <w:lsdException w:unhideWhenUsed="0" w:uiPriority="60" w:semiHidden="0" w:name="Light Shading Accent 5"/>
+    <w:lsdException w:unhideWhenUsed="0" w:uiPriority="61" w:semiHidden="0" w:name="Light List Accent 5"/>
+    <w:lsdException w:unhideWhenUsed="0" w:uiPriority="62" w:semiHidden="0" w:name="Light Grid Accent 5"/>
+    <w:lsdException w:unhideWhenUsed="0" w:uiPriority="63" w:semiHidden="0" w:name="Medium Shading 1 Accent 5"/>
+    <w:lsdException w:unhideWhenUsed="0" w:uiPriority="64" w:semiHidden="0" w:name="Medium Shading 2 Accent 5"/>
+    <w:lsdException w:unhideWhenUsed="0" w:uiPriority="65" w:semiHidden="0" w:name="Medium List 1 Accent 5"/>
+    <w:lsdException w:unhideWhenUsed="0" w:uiPriority="66" w:semiHidden="0" w:name="Medium List 2 Accent 5"/>
+    <w:lsdException w:unhideWhenUsed="0" w:uiPriority="67" w:semiHidden="0" w:name="Medium Grid 1 Accent 5"/>
+    <w:lsdException w:unhideWhenUsed="0" w:uiPriority="68" w:semiHidden="0" w:name="Medium Grid 2 Accent 5"/>
+    <w:lsdException w:unhideWhenUsed="0" w:uiPriority="69" w:semiHidden="0" w:name="Medium Grid 3 Accent 5"/>
+    <w:lsdException w:unhideWhenUsed="0" w:uiPriority="70" w:semiHidden="0" w:name="Dark List Accent 5"/>
+    <w:lsdException w:unhideWhenUsed="0" w:uiPriority="71" w:semiHidden="0" w:name="Colorful Shading Accent 5"/>
+    <w:lsdException w:unhideWhenUsed="0" w:uiPriority="72" w:semiHidden="0" w:name="Colorful List Accent 5"/>
+    <w:lsdException w:unhideWhenUsed="0" w:uiPriority="73" w:semiHidden="0" w:name="Colorful Grid Accent 5"/>
+    <w:lsdException w:unhideWhenUsed="0" w:uiPriority="60" w:semiHidden="0" w:name="Light Shading Accent 6"/>
+    <w:lsdException w:unhideWhenUsed="0" w:uiPriority="61" w:semiHidden="0" w:name="Light List Accent 6"/>
+    <w:lsdException w:unhideWhenUsed="0" w:uiPriority="62" w:semiHidden="0" w:name="Light Grid Accent 6"/>
+    <w:lsdException w:unhideWhenUsed="0" w:uiPriority="63" w:semiHidden="0" w:name="Medium Shading 1 Accent 6"/>
+    <w:lsdException w:unhideWhenUsed="0" w:uiPriority="64" w:semiHidden="0" w:name="Medium Shading 2 Accent 6"/>
+    <w:lsdException w:unhideWhenUsed="0" w:uiPriority="65" w:semiHidden="0" w:name="Medium List 1 Accent 6"/>
+    <w:lsdException w:unhideWhenUsed="0" w:uiPriority="66" w:semiHidden="0" w:name="Medium List 2 Accent 6"/>
+    <w:lsdException w:unhideWhenUsed="0" w:uiPriority="67" w:semiHidden="0" w:name="Medium Grid 1 Accent 6"/>
+    <w:lsdException w:unhideWhenUsed="0" w:uiPriority="68" w:semiHidden="0" w:name="Medium Grid 2 Accent 6"/>
+    <w:lsdException w:unhideWhenUsed="0" w:uiPriority="69" w:semiHidden="0" w:name="Medium Grid 3 Accent 6"/>
+    <w:lsdException w:unhideWhenUsed="0" w:uiPriority="70" w:semiHidden="0" w:name="Dark List Accent 6"/>
+    <w:lsdException w:unhideWhenUsed="0" w:uiPriority="71" w:semiHidden="0" w:name="Colorful Shading Accent 6"/>
+    <w:lsdException w:unhideWhenUsed="0" w:uiPriority="72" w:semiHidden="0" w:name="Colorful List Accent 6"/>
+    <w:lsdException w:unhideWhenUsed="0" w:uiPriority="73" w:semiHidden="0" w:name="Colorful Grid Accent 6"/>
+  </w:latentStyles>
+  <w:style w:type="paragraph" w:default="1" w:styleId="1">
+    <w:name w:val="Normal"/>
     <w:qFormat/>
+    <w:uiPriority w:val="0"/>
     <w:rPr>
-      <w:sz w:val="56"/>
-      <w:szCs w:val="56"/>
+      <w:sz w:val="21"/>
+      <w:szCs w:val="22"/>
     </w:rPr>
   </w:style>
-  <w:style w:type="paragraph" w:styleId="Heading1">
-    <w:name w:val="Heading 1"/>
-    <w:basedOn w:val="Normal"/>
-    <w:next w:val="Normal"/>
+  <w:style w:type="paragraph" w:styleId="2">
+    <w:name w:val="heading 1"/>
+    <w:next w:val="1"/>
     <w:qFormat/>
+    <w:uiPriority w:val="0"/>
     <w:rPr>
       <w:color w:val="2E74B5"/>
       <w:sz w:val="32"/>
       <w:szCs w:val="32"/>
     </w:rPr>
   </w:style>
-  <w:style w:type="paragraph" w:styleId="Heading2">
-    <w:name w:val="Heading 2"/>
-    <w:basedOn w:val="Normal"/>
-    <w:next w:val="Normal"/>
+  <w:style w:type="paragraph" w:styleId="3">
+    <w:name w:val="heading 2"/>
+    <w:next w:val="1"/>
     <w:qFormat/>
+    <w:uiPriority w:val="0"/>
     <w:rPr>
       <w:color w:val="2E74B5"/>
       <w:sz w:val="26"/>
       <w:szCs w:val="26"/>
     </w:rPr>
   </w:style>
-  <w:style w:type="paragraph" w:styleId="Heading3">
-    <w:name w:val="Heading 3"/>
-    <w:basedOn w:val="Normal"/>
-    <w:next w:val="Normal"/>
+  <w:style w:type="paragraph" w:styleId="4">
+    <w:name w:val="heading 3"/>
+    <w:next w:val="1"/>
     <w:qFormat/>
+    <w:uiPriority w:val="0"/>
     <w:rPr>
       <w:color w:val="1F4D78"/>
       <w:sz w:val="24"/>
       <w:szCs w:val="24"/>
     </w:rPr>
   </w:style>
-  <w:style w:type="paragraph" w:styleId="Heading4">
-    <w:name w:val="Heading 4"/>
-    <w:basedOn w:val="Normal"/>
-    <w:next w:val="Normal"/>
+  <w:style w:type="paragraph" w:styleId="5">
+    <w:name w:val="heading 4"/>
+    <w:next w:val="1"/>
     <w:qFormat/>
+    <w:uiPriority w:val="0"/>
     <w:rPr>
       <w:i/>
       <w:iCs/>
       <w:color w:val="2E74B5"/>
+      <w:sz w:val="21"/>
+      <w:szCs w:val="22"/>
     </w:rPr>
   </w:style>
-  <w:style w:type="paragraph" w:styleId="Heading5">
-    <w:name w:val="Heading 5"/>
-    <w:basedOn w:val="Normal"/>
-    <w:next w:val="Normal"/>
+  <w:style w:type="paragraph" w:styleId="6">
+    <w:name w:val="heading 5"/>
+    <w:next w:val="1"/>
     <w:qFormat/>
+    <w:uiPriority w:val="0"/>
     <w:rPr>
       <w:color w:val="2E74B5"/>
+      <w:sz w:val="21"/>
+      <w:szCs w:val="22"/>
     </w:rPr>
   </w:style>
-  <w:style w:type="paragraph" w:styleId="Heading6">
-    <w:name w:val="Heading 6"/>
-    <w:basedOn w:val="Normal"/>
-    <w:next w:val="Normal"/>
+  <w:style w:type="paragraph" w:styleId="7">
+    <w:name w:val="heading 6"/>
+    <w:next w:val="1"/>
     <w:qFormat/>
+    <w:uiPriority w:val="0"/>
     <w:rPr>
       <w:color w:val="1F4D78"/>
+      <w:sz w:val="21"/>
+      <w:szCs w:val="22"/>
     </w:rPr>
   </w:style>
-  <w:style w:type="paragraph" w:styleId="Strong">
-    <w:name w:val="Strong"/>
-    <w:basedOn w:val="Normal"/>
-    <w:next w:val="Normal"/>
+  <w:style w:type="character" w:default="1" w:styleId="8">
+    <w:name w:val="Default Paragraph Font"/>
+    <w:semiHidden/>
     <w:qFormat/>
-    <w:rPr>
-      <w:b/>
-      <w:bCs/>
-    </w:rPr>
+    <w:uiPriority w:val="0"/>
   </w:style>
-  <w:style w:type="paragraph" w:styleId="ListParagraph">
-    <w:name w:val="List Paragraph"/>
-    <w:basedOn w:val="Normal"/>
-    <w:qFormat/>
+  <w:style w:type="table" w:default="1" w:styleId="9">
+    <w:name w:val="Normal Table"/>
+    <w:semiHidden/>
+    <w:uiPriority w:val="0"/>
+    <w:tblPr>
+      <w:tblCellMar>
+        <w:top w:w="0" w:type="dxa"/>
+        <w:left w:w="108" w:type="dxa"/>
+        <w:bottom w:w="0" w:type="dxa"/>
+        <w:right w:w="108" w:type="dxa"/>
+      </w:tblCellMar>
+    </w:tblPr>
   </w:style>
-  <w:style w:type="character" w:styleId="Hyperlink">
-    <w:name w:val="Hyperlink"/>
-    <w:basedOn w:val="DefaultParagraphFont"/>
-    <w:uiPriority w:val="99"/>
-    <w:unhideWhenUsed/>
-    <w:rPr>
-      <w:color w:val="0563C1"/>
-      <w:u w:val="single"/>
-    </w:rPr>
-  </w:style>
-  <w:style w:type="character" w:styleId="FootnoteReference">
-    <w:name w:val="footnote reference"/>
-    <w:basedOn w:val="DefaultParagraphFont"/>
-    <w:uiPriority w:val="99"/>
+  <w:style w:type="character" w:styleId="10">
+    <w:name w:val="endnote reference"/>
     <w:semiHidden/>
     <w:unhideWhenUsed/>
+    <w:qFormat/>
+    <w:uiPriority w:val="99"/>
     <w:rPr>
       <w:vertAlign w:val="superscript"/>
     </w:rPr>
   </w:style>
-  <w:style w:type="paragraph" w:styleId="FootnoteText">
-    <w:name w:val="footnote text"/>
-    <w:basedOn w:val="Normal"/>
-    <w:link w:val="FootnoteTextChar"/>
-    <w:uiPriority w:val="99"/>
+  <w:style w:type="paragraph" w:styleId="11">
+    <w:name w:val="endnote text"/>
+    <w:link w:val="18"/>
     <w:semiHidden/>
     <w:unhideWhenUsed/>
+    <w:qFormat/>
+    <w:uiPriority w:val="99"/>
     <w:pPr>
       <w:spacing w:after="0" w:line="240" w:lineRule="auto"/>
     </w:pPr>
@@ -1313,35 +1643,23 @@
       <w:szCs w:val="20"/>
     </w:rPr>
   </w:style>
-  <w:style w:type="character" w:styleId="FootnoteTextChar">
-    <w:name w:val="Footnote Text Char"/>
-    <w:basedOn w:val="DefaultParagraphFont"/>
-    <w:link w:val="FootnoteText"/>
-    <w:uiPriority w:val="99"/>
+  <w:style w:type="character" w:styleId="12">
+    <w:name w:val="footnote reference"/>
     <w:semiHidden/>
     <w:unhideWhenUsed/>
-    <w:rPr>
-      <w:sz w:val="20"/>
-      <w:szCs w:val="20"/>
-    </w:rPr>
-  </w:style>
-  <w:style w:type="character" w:styleId="EndnoteReference">
-    <w:name w:val="endnote reference"/>
-    <w:basedOn w:val="DefaultParagraphFont"/>
+    <w:qFormat/>
     <w:uiPriority w:val="99"/>
-    <w:semiHidden/>
-    <w:unhideWhenUsed/>
     <w:rPr>
       <w:vertAlign w:val="superscript"/>
     </w:rPr>
   </w:style>
-  <w:style w:type="paragraph" w:styleId="EndnoteText">
-    <w:name w:val="endnote text"/>
-    <w:basedOn w:val="Normal"/>
-    <w:link w:val="EndnoteTextChar"/>
-    <w:uiPriority w:val="99"/>
+  <w:style w:type="paragraph" w:styleId="13">
+    <w:name w:val="footnote text"/>
+    <w:link w:val="17"/>
     <w:semiHidden/>
     <w:unhideWhenUsed/>
+    <w:qFormat/>
+    <w:uiPriority w:val="99"/>
     <w:pPr>
       <w:spacing w:after="0" w:line="240" w:lineRule="auto"/>
     </w:pPr>
@@ -1350,17 +1668,341 @@
       <w:szCs w:val="20"/>
     </w:rPr>
   </w:style>
-  <w:style w:type="character" w:styleId="EndnoteTextChar">
-    <w:name w:val="Endnote Text Char"/>
-    <w:basedOn w:val="DefaultParagraphFont"/>
-    <w:link w:val="EndnoteText"/>
+  <w:style w:type="character" w:styleId="14">
+    <w:name w:val="Hyperlink"/>
+    <w:unhideWhenUsed/>
+    <w:qFormat/>
     <w:uiPriority w:val="99"/>
+    <w:rPr>
+      <w:color w:val="0563C1"/>
+      <w:u w:val="single"/>
+    </w:rPr>
+  </w:style>
+  <w:style w:type="paragraph" w:styleId="15">
+    <w:name w:val="Title"/>
+    <w:qFormat/>
+    <w:uiPriority w:val="0"/>
+    <w:rPr>
+      <w:sz w:val="56"/>
+      <w:szCs w:val="56"/>
+    </w:rPr>
+  </w:style>
+  <w:style w:type="paragraph" w:styleId="16">
+    <w:name w:val="List Paragraph"/>
+    <w:qFormat/>
+    <w:uiPriority w:val="0"/>
+    <w:rPr>
+      <w:sz w:val="21"/>
+      <w:szCs w:val="22"/>
+    </w:rPr>
+  </w:style>
+  <w:style w:type="character" w:customStyle="1" w:styleId="17">
+    <w:name w:val="Footnote Text Char"/>
+    <w:link w:val="13"/>
     <w:semiHidden/>
     <w:unhideWhenUsed/>
+    <w:qFormat/>
+    <w:uiPriority w:val="99"/>
+    <w:rPr>
+      <w:sz w:val="20"/>
+      <w:szCs w:val="20"/>
+    </w:rPr>
+  </w:style>
+  <w:style w:type="character" w:customStyle="1" w:styleId="18">
+    <w:name w:val="Endnote Text Char"/>
+    <w:link w:val="11"/>
+    <w:semiHidden/>
+    <w:unhideWhenUsed/>
+    <w:qFormat/>
+    <w:uiPriority w:val="99"/>
     <w:rPr>
       <w:sz w:val="20"/>
       <w:szCs w:val="20"/>
     </w:rPr>
   </w:style>
 </w:styles>
+</file>
+
+<file path=word/theme/theme1.xml><?xml version="1.0" encoding="utf-8"?>
+<a:theme xmlns:a="http://schemas.openxmlformats.org/drawingml/2006/main" name="Office">
+  <a:themeElements>
+    <a:clrScheme name="Office">
+      <a:dk1>
+        <a:sysClr val="windowText" lastClr="000000"/>
+      </a:dk1>
+      <a:lt1>
+        <a:sysClr val="window" lastClr="FFFFFF"/>
+      </a:lt1>
+      <a:dk2>
+        <a:srgbClr val="1F497D"/>
+      </a:dk2>
+      <a:lt2>
+        <a:srgbClr val="EEECE1"/>
+      </a:lt2>
+      <a:accent1>
+        <a:srgbClr val="4F81BD"/>
+      </a:accent1>
+      <a:accent2>
+        <a:srgbClr val="C0504D"/>
+      </a:accent2>
+      <a:accent3>
+        <a:srgbClr val="9BBB59"/>
+      </a:accent3>
+      <a:accent4>
+        <a:srgbClr val="8064A2"/>
+      </a:accent4>
+      <a:accent5>
+        <a:srgbClr val="4BACC6"/>
+      </a:accent5>
+      <a:accent6>
+        <a:srgbClr val="F79646"/>
+      </a:accent6>
+      <a:hlink>
+        <a:srgbClr val="0000FF"/>
+      </a:hlink>
+      <a:folHlink>
+        <a:srgbClr val="800080"/>
+      </a:folHlink>
+    </a:clrScheme>
+    <a:fontScheme name="Office">
+      <a:majorFont>
+        <a:latin typeface="Cambria"/>
+        <a:ea typeface=""/>
+        <a:cs typeface=""/>
+        <a:font script="Jpan" typeface="游ゴシック Light"/>
+        <a:font script="Hang" typeface="맑은 고딕"/>
+        <a:font script="Hans" typeface="宋体"/>
+        <a:font script="Hant" typeface="新細明體"/>
+        <a:font script="Arab" typeface="Times New Roman"/>
+        <a:font script="Hebr" typeface="Times New Roman"/>
+        <a:font script="Thai" typeface="Angsana New"/>
+        <a:font script="Ethi" typeface="Nyala"/>
+        <a:font script="Beng" typeface="Vrinda"/>
+        <a:font script="Gujr" typeface="Shruti"/>
+        <a:font script="Khmr" typeface="MoolBoran"/>
+        <a:font script="Knda" typeface="Tunga"/>
+        <a:font script="Guru" typeface="Raavi"/>
+        <a:font script="Cans" typeface="Euphemia"/>
+        <a:font script="Cher" typeface="Plantagenet Cherokee"/>
+        <a:font script="Yiii" typeface="Microsoft Yi Baiti"/>
+        <a:font script="Tibt" typeface="Microsoft Himalaya"/>
+        <a:font script="Thaa" typeface="MV Boli"/>
+        <a:font script="Deva" typeface="Mangal"/>
+        <a:font script="Telu" typeface="Gautami"/>
+        <a:font script="Taml" typeface="Latha"/>
+        <a:font script="Syrc" typeface="Estrangelo Edessa"/>
+        <a:font script="Orya" typeface="Kalinga"/>
+        <a:font script="Mlym" typeface="Kartika"/>
+        <a:font script="Laoo" typeface="DokChampa"/>
+        <a:font script="Sinh" typeface="Iskoola Pota"/>
+        <a:font script="Mong" typeface="Mongolian Baiti"/>
+        <a:font script="Viet" typeface="Times New Roman"/>
+        <a:font script="Uigh" typeface="Microsoft Uighur"/>
+        <a:font script="Geor" typeface="Sylfaen"/>
+      </a:majorFont>
+      <a:minorFont>
+        <a:latin typeface="Calibri"/>
+        <a:ea typeface=""/>
+        <a:cs typeface=""/>
+        <a:font script="Jpan" typeface="游明朝"/>
+        <a:font script="Hang" typeface="맑은 고딕"/>
+        <a:font script="Hans" typeface="宋体"/>
+        <a:font script="Hant" typeface="新細明體"/>
+        <a:font script="Arab" typeface="Arial"/>
+        <a:font script="Hebr" typeface="Arial"/>
+        <a:font script="Thai" typeface="Cordia New"/>
+        <a:font script="Ethi" typeface="Nyala"/>
+        <a:font script="Beng" typeface="Vrinda"/>
+        <a:font script="Gujr" typeface="Shruti"/>
+        <a:font script="Khmr" typeface="DaunPenh"/>
+        <a:font script="Knda" typeface="Tunga"/>
+        <a:font script="Guru" typeface="Raavi"/>
+        <a:font script="Cans" typeface="Euphemia"/>
+        <a:font script="Cher" typeface="Plantagenet Cherokee"/>
+        <a:font script="Yiii" typeface="Microsoft Yi Baiti"/>
+        <a:font script="Tibt" typeface="Microsoft Himalaya"/>
+        <a:font script="Thaa" typeface="MV Boli"/>
+        <a:font script="Deva" typeface="Mangal"/>
+        <a:font script="Telu" typeface="Gautami"/>
+        <a:font script="Taml" typeface="Latha"/>
+        <a:font script="Syrc" typeface="Estrangelo Edessa"/>
+        <a:font script="Orya" typeface="Kalinga"/>
+        <a:font script="Mlym" typeface="Kartika"/>
+        <a:font script="Laoo" typeface="DokChampa"/>
+        <a:font script="Sinh" typeface="Iskoola Pota"/>
+        <a:font script="Mong" typeface="Mongolian Baiti"/>
+        <a:font script="Viet" typeface="Arial"/>
+        <a:font script="Uigh" typeface="Microsoft Uighur"/>
+        <a:font script="Geor" typeface="Sylfaen"/>
+      </a:minorFont>
+    </a:fontScheme>
+    <a:fmtScheme name="Office">
+      <a:fillStyleLst>
+        <a:solidFill>
+          <a:schemeClr val="phClr"/>
+        </a:solidFill>
+        <a:gradFill rotWithShape="1">
+          <a:gsLst>
+            <a:gs pos="0">
+              <a:schemeClr val="phClr">
+                <a:tint val="50000"/>
+                <a:satMod val="300000"/>
+              </a:schemeClr>
+            </a:gs>
+            <a:gs pos="35000">
+              <a:schemeClr val="phClr">
+                <a:tint val="37000"/>
+                <a:satMod val="300000"/>
+              </a:schemeClr>
+            </a:gs>
+            <a:gs pos="100000">
+              <a:schemeClr val="phClr">
+                <a:tint val="15000"/>
+                <a:satMod val="350000"/>
+              </a:schemeClr>
+            </a:gs>
+          </a:gsLst>
+          <a:lin ang="16200000" scaled="1"/>
+        </a:gradFill>
+        <a:gradFill rotWithShape="1">
+          <a:gsLst>
+            <a:gs pos="0">
+              <a:schemeClr val="phClr">
+                <a:shade val="51000"/>
+                <a:satMod val="130000"/>
+              </a:schemeClr>
+            </a:gs>
+            <a:gs pos="80000">
+              <a:schemeClr val="phClr">
+                <a:shade val="93000"/>
+                <a:satMod val="130000"/>
+              </a:schemeClr>
+            </a:gs>
+            <a:gs pos="100000">
+              <a:schemeClr val="phClr">
+                <a:shade val="94000"/>
+                <a:satMod val="135000"/>
+              </a:schemeClr>
+            </a:gs>
+          </a:gsLst>
+          <a:lin ang="16200000" scaled="0"/>
+        </a:gradFill>
+      </a:fillStyleLst>
+      <a:lnStyleLst>
+        <a:ln w="9525" cap="flat" cmpd="sng" algn="ctr">
+          <a:solidFill>
+            <a:schemeClr val="phClr">
+              <a:shade val="95000"/>
+              <a:satMod val="105000"/>
+            </a:schemeClr>
+          </a:solidFill>
+          <a:prstDash val="solid"/>
+        </a:ln>
+        <a:ln w="25400" cap="flat" cmpd="sng" algn="ctr">
+          <a:solidFill>
+            <a:schemeClr val="phClr"/>
+          </a:solidFill>
+          <a:prstDash val="solid"/>
+        </a:ln>
+        <a:ln w="38100" cap="flat" cmpd="sng" algn="ctr">
+          <a:solidFill>
+            <a:schemeClr val="phClr"/>
+          </a:solidFill>
+          <a:prstDash val="solid"/>
+        </a:ln>
+      </a:lnStyleLst>
+      <a:effectStyleLst>
+        <a:effectStyle>
+          <a:effectLst>
+            <a:outerShdw blurRad="40000" dist="20000" dir="5400000" rotWithShape="0">
+              <a:srgbClr val="000000">
+                <a:alpha val="38000"/>
+              </a:srgbClr>
+            </a:outerShdw>
+          </a:effectLst>
+        </a:effectStyle>
+        <a:effectStyle>
+          <a:effectLst>
+            <a:outerShdw blurRad="40000" dist="23000" dir="5400000" rotWithShape="0">
+              <a:srgbClr val="000000">
+                <a:alpha val="35000"/>
+              </a:srgbClr>
+            </a:outerShdw>
+          </a:effectLst>
+        </a:effectStyle>
+        <a:effectStyle>
+          <a:effectLst>
+            <a:outerShdw blurRad="40000" dist="23000" dir="5400000" rotWithShape="0">
+              <a:srgbClr val="000000">
+                <a:alpha val="35000"/>
+              </a:srgbClr>
+            </a:outerShdw>
+          </a:effectLst>
+          <a:scene3d>
+            <a:camera prst="orthographicFront">
+              <a:rot lat="0" lon="0" rev="0"/>
+            </a:camera>
+            <a:lightRig rig="threePt" dir="t">
+              <a:rot lat="0" lon="0" rev="1200000"/>
+            </a:lightRig>
+          </a:scene3d>
+          <a:sp3d>
+            <a:bevelT w="63500" h="25400"/>
+          </a:sp3d>
+        </a:effectStyle>
+      </a:effectStyleLst>
+      <a:bgFillStyleLst>
+        <a:solidFill>
+          <a:schemeClr val="phClr"/>
+        </a:solidFill>
+        <a:gradFill rotWithShape="1">
+          <a:gsLst>
+            <a:gs pos="0">
+              <a:schemeClr val="phClr">
+                <a:tint val="40000"/>
+                <a:satMod val="350000"/>
+              </a:schemeClr>
+            </a:gs>
+            <a:gs pos="40000">
+              <a:schemeClr val="phClr">
+                <a:tint val="45000"/>
+                <a:satMod val="350000"/>
+                <a:shade val="99000"/>
+              </a:schemeClr>
+            </a:gs>
+            <a:gs pos="100000">
+              <a:schemeClr val="phClr">
+                <a:shade val="20000"/>
+                <a:satMod val="255000"/>
+              </a:schemeClr>
+            </a:gs>
+          </a:gsLst>
+          <a:path path="circle">
+            <a:fillToRect l="50000" t="-80000" r="50000" b="180000"/>
+          </a:path>
+        </a:gradFill>
+        <a:gradFill rotWithShape="1">
+          <a:gsLst>
+            <a:gs pos="0">
+              <a:schemeClr val="phClr">
+                <a:tint val="80000"/>
+                <a:satMod val="300000"/>
+              </a:schemeClr>
+            </a:gs>
+            <a:gs pos="100000">
+              <a:schemeClr val="phClr">
+                <a:shade val="30000"/>
+                <a:satMod val="200000"/>
+              </a:schemeClr>
+            </a:gs>
+          </a:gsLst>
+          <a:path path="circle">
+            <a:fillToRect l="50000" t="50000" r="50000" b="50000"/>
+          </a:path>
+        </a:gradFill>
+      </a:bgFillStyleLst>
+    </a:fmtScheme>
+  </a:themeElements>
+  <a:objectDefaults/>
+</a:theme>
 </file>
</xml_diff>